<commit_message>
Task a and b
</commit_message>
<xml_diff>
--- a/Report/Data Warehousing & Business Intelligence Assesment 2.docx
+++ b/Report/Data Warehousing & Business Intelligence Assesment 2.docx
@@ -79,7 +79,15 @@
     <w:sdt>
       <w:sdtPr>
         <w:rPr>
-          <w:rFonts w:asciiTheme="minorHAnsi" w:hAnsiTheme="minorHAnsi"/>
+          <w:rFonts w:asciiTheme="minorHAnsi" w:eastAsiaTheme="minorHAnsi" w:hAnsiTheme="minorHAnsi" w:cstheme="minorBidi"/>
+          <w:b w:val="0"/>
+          <w:bCs w:val="0"/>
+          <w:color w:val="auto"/>
+          <w:kern w:val="2"/>
+          <w:sz w:val="24"/>
+          <w:szCs w:val="24"/>
+          <w:lang w:val="en-GB"/>
+          <w14:ligatures w14:val="standardContextual"/>
         </w:rPr>
         <w:id w:val="-1187441298"/>
         <w:docPartObj>
@@ -89,14 +97,7 @@
       </w:sdtPr>
       <w:sdtEndPr>
         <w:rPr>
-          <w:rFonts w:eastAsiaTheme="minorHAnsi" w:cstheme="minorBidi"/>
           <w:noProof/>
-          <w:color w:val="auto"/>
-          <w:kern w:val="2"/>
-          <w:sz w:val="24"/>
-          <w:szCs w:val="24"/>
-          <w:lang w:val="en-GB"/>
-          <w14:ligatures w14:val="standardContextual"/>
         </w:rPr>
       </w:sdtEndPr>
       <w:sdtContent>
@@ -147,7 +148,7 @@
             </w:rPr>
             <w:fldChar w:fldCharType="separate"/>
           </w:r>
-          <w:hyperlink w:anchor="_Toc226212758" w:history="1">
+          <w:hyperlink w:anchor="_Toc226965359" w:history="1">
             <w:r>
               <w:rPr>
                 <w:rStyle w:val="Hyperlink"/>
@@ -174,7 +175,7 @@
                 <w:noProof/>
                 <w:webHidden/>
               </w:rPr>
-              <w:instrText xml:space="preserve"> PAGEREF _Toc226212758 \h </w:instrText>
+              <w:instrText xml:space="preserve"> PAGEREF _Toc226965359 \h </w:instrText>
             </w:r>
             <w:r>
               <w:rPr>
@@ -194,7 +195,801 @@
                 <w:noProof/>
                 <w:webHidden/>
               </w:rPr>
-              <w:t>2</w:t>
+              <w:t>4</w:t>
+            </w:r>
+            <w:r>
+              <w:rPr>
+                <w:noProof/>
+                <w:webHidden/>
+              </w:rPr>
+              <w:fldChar w:fldCharType="end"/>
+            </w:r>
+          </w:hyperlink>
+        </w:p>
+        <w:p>
+          <w:pPr>
+            <w:pStyle w:val="TOC3"/>
+            <w:tabs>
+              <w:tab w:val="right" w:leader="dot" w:pos="9016"/>
+            </w:tabs>
+            <w:rPr>
+              <w:rFonts w:eastAsiaTheme="minorEastAsia"/>
+              <w:noProof/>
+              <w:sz w:val="24"/>
+              <w:szCs w:val="24"/>
+              <w:lang w:eastAsia="en-GB"/>
+            </w:rPr>
+          </w:pPr>
+          <w:hyperlink w:anchor="_Toc226965360" w:history="1">
+            <w:r>
+              <w:rPr>
+                <w:rStyle w:val="Hyperlink"/>
+                <w:noProof/>
+              </w:rPr>
+              <w:t>Figure 1. Tickers List</w:t>
+            </w:r>
+            <w:r>
+              <w:rPr>
+                <w:noProof/>
+                <w:webHidden/>
+              </w:rPr>
+              <w:tab/>
+            </w:r>
+            <w:r>
+              <w:rPr>
+                <w:noProof/>
+                <w:webHidden/>
+              </w:rPr>
+              <w:fldChar w:fldCharType="begin"/>
+            </w:r>
+            <w:r>
+              <w:rPr>
+                <w:noProof/>
+                <w:webHidden/>
+              </w:rPr>
+              <w:instrText xml:space="preserve"> PAGEREF _Toc226965360 \h </w:instrText>
+            </w:r>
+            <w:r>
+              <w:rPr>
+                <w:noProof/>
+                <w:webHidden/>
+              </w:rPr>
+            </w:r>
+            <w:r>
+              <w:rPr>
+                <w:noProof/>
+                <w:webHidden/>
+              </w:rPr>
+              <w:fldChar w:fldCharType="separate"/>
+            </w:r>
+            <w:r>
+              <w:rPr>
+                <w:noProof/>
+                <w:webHidden/>
+              </w:rPr>
+              <w:t>4</w:t>
+            </w:r>
+            <w:r>
+              <w:rPr>
+                <w:noProof/>
+                <w:webHidden/>
+              </w:rPr>
+              <w:fldChar w:fldCharType="end"/>
+            </w:r>
+          </w:hyperlink>
+        </w:p>
+        <w:p>
+          <w:pPr>
+            <w:pStyle w:val="TOC3"/>
+            <w:tabs>
+              <w:tab w:val="right" w:leader="dot" w:pos="9016"/>
+            </w:tabs>
+            <w:rPr>
+              <w:rFonts w:eastAsiaTheme="minorEastAsia"/>
+              <w:noProof/>
+              <w:sz w:val="24"/>
+              <w:szCs w:val="24"/>
+              <w:lang w:eastAsia="en-GB"/>
+            </w:rPr>
+          </w:pPr>
+          <w:hyperlink w:anchor="_Toc226965361" w:history="1">
+            <w:r>
+              <w:rPr>
+                <w:rStyle w:val="Hyperlink"/>
+                <w:noProof/>
+              </w:rPr>
+              <w:t>Figure 2. Dataset Shape</w:t>
+            </w:r>
+            <w:r>
+              <w:rPr>
+                <w:noProof/>
+                <w:webHidden/>
+              </w:rPr>
+              <w:tab/>
+            </w:r>
+            <w:r>
+              <w:rPr>
+                <w:noProof/>
+                <w:webHidden/>
+              </w:rPr>
+              <w:fldChar w:fldCharType="begin"/>
+            </w:r>
+            <w:r>
+              <w:rPr>
+                <w:noProof/>
+                <w:webHidden/>
+              </w:rPr>
+              <w:instrText xml:space="preserve"> PAGEREF _Toc226965361 \h </w:instrText>
+            </w:r>
+            <w:r>
+              <w:rPr>
+                <w:noProof/>
+                <w:webHidden/>
+              </w:rPr>
+            </w:r>
+            <w:r>
+              <w:rPr>
+                <w:noProof/>
+                <w:webHidden/>
+              </w:rPr>
+              <w:fldChar w:fldCharType="separate"/>
+            </w:r>
+            <w:r>
+              <w:rPr>
+                <w:noProof/>
+                <w:webHidden/>
+              </w:rPr>
+              <w:t>4</w:t>
+            </w:r>
+            <w:r>
+              <w:rPr>
+                <w:noProof/>
+                <w:webHidden/>
+              </w:rPr>
+              <w:fldChar w:fldCharType="end"/>
+            </w:r>
+          </w:hyperlink>
+        </w:p>
+        <w:p>
+          <w:pPr>
+            <w:pStyle w:val="TOC3"/>
+            <w:tabs>
+              <w:tab w:val="right" w:leader="dot" w:pos="9016"/>
+            </w:tabs>
+            <w:rPr>
+              <w:rFonts w:eastAsiaTheme="minorEastAsia"/>
+              <w:noProof/>
+              <w:sz w:val="24"/>
+              <w:szCs w:val="24"/>
+              <w:lang w:eastAsia="en-GB"/>
+            </w:rPr>
+          </w:pPr>
+          <w:hyperlink w:anchor="_Toc226965362" w:history="1">
+            <w:r>
+              <w:rPr>
+                <w:rStyle w:val="Hyperlink"/>
+                <w:noProof/>
+              </w:rPr>
+              <w:t>Figure 3. Cleaning (Before &amp; After)</w:t>
+            </w:r>
+            <w:r>
+              <w:rPr>
+                <w:noProof/>
+                <w:webHidden/>
+              </w:rPr>
+              <w:tab/>
+            </w:r>
+            <w:r>
+              <w:rPr>
+                <w:noProof/>
+                <w:webHidden/>
+              </w:rPr>
+              <w:fldChar w:fldCharType="begin"/>
+            </w:r>
+            <w:r>
+              <w:rPr>
+                <w:noProof/>
+                <w:webHidden/>
+              </w:rPr>
+              <w:instrText xml:space="preserve"> PAGEREF _Toc226965362 \h </w:instrText>
+            </w:r>
+            <w:r>
+              <w:rPr>
+                <w:noProof/>
+                <w:webHidden/>
+              </w:rPr>
+            </w:r>
+            <w:r>
+              <w:rPr>
+                <w:noProof/>
+                <w:webHidden/>
+              </w:rPr>
+              <w:fldChar w:fldCharType="separate"/>
+            </w:r>
+            <w:r>
+              <w:rPr>
+                <w:noProof/>
+                <w:webHidden/>
+              </w:rPr>
+              <w:t>5</w:t>
+            </w:r>
+            <w:r>
+              <w:rPr>
+                <w:noProof/>
+                <w:webHidden/>
+              </w:rPr>
+              <w:fldChar w:fldCharType="end"/>
+            </w:r>
+          </w:hyperlink>
+        </w:p>
+        <w:p>
+          <w:pPr>
+            <w:pStyle w:val="TOC3"/>
+            <w:tabs>
+              <w:tab w:val="right" w:leader="dot" w:pos="9016"/>
+            </w:tabs>
+            <w:rPr>
+              <w:rFonts w:eastAsiaTheme="minorEastAsia"/>
+              <w:noProof/>
+              <w:sz w:val="24"/>
+              <w:szCs w:val="24"/>
+              <w:lang w:eastAsia="en-GB"/>
+            </w:rPr>
+          </w:pPr>
+          <w:hyperlink w:anchor="_Toc226965363" w:history="1">
+            <w:r>
+              <w:rPr>
+                <w:rStyle w:val="Hyperlink"/>
+                <w:noProof/>
+              </w:rPr>
+              <w:t>Figure 4. Daily Returns</w:t>
+            </w:r>
+            <w:r>
+              <w:rPr>
+                <w:noProof/>
+                <w:webHidden/>
+              </w:rPr>
+              <w:tab/>
+            </w:r>
+            <w:r>
+              <w:rPr>
+                <w:noProof/>
+                <w:webHidden/>
+              </w:rPr>
+              <w:fldChar w:fldCharType="begin"/>
+            </w:r>
+            <w:r>
+              <w:rPr>
+                <w:noProof/>
+                <w:webHidden/>
+              </w:rPr>
+              <w:instrText xml:space="preserve"> PAGEREF _Toc226965363 \h </w:instrText>
+            </w:r>
+            <w:r>
+              <w:rPr>
+                <w:noProof/>
+                <w:webHidden/>
+              </w:rPr>
+            </w:r>
+            <w:r>
+              <w:rPr>
+                <w:noProof/>
+                <w:webHidden/>
+              </w:rPr>
+              <w:fldChar w:fldCharType="separate"/>
+            </w:r>
+            <w:r>
+              <w:rPr>
+                <w:noProof/>
+                <w:webHidden/>
+              </w:rPr>
+              <w:t>5</w:t>
+            </w:r>
+            <w:r>
+              <w:rPr>
+                <w:noProof/>
+                <w:webHidden/>
+              </w:rPr>
+              <w:fldChar w:fldCharType="end"/>
+            </w:r>
+          </w:hyperlink>
+        </w:p>
+        <w:p>
+          <w:pPr>
+            <w:pStyle w:val="TOC3"/>
+            <w:tabs>
+              <w:tab w:val="right" w:leader="dot" w:pos="9016"/>
+            </w:tabs>
+            <w:rPr>
+              <w:rFonts w:eastAsiaTheme="minorEastAsia"/>
+              <w:noProof/>
+              <w:sz w:val="24"/>
+              <w:szCs w:val="24"/>
+              <w:lang w:eastAsia="en-GB"/>
+            </w:rPr>
+          </w:pPr>
+          <w:hyperlink w:anchor="_Toc226965364" w:history="1">
+            <w:r>
+              <w:rPr>
+                <w:rStyle w:val="Hyperlink"/>
+                <w:noProof/>
+              </w:rPr>
+              <w:t>Figure 5. Beta Table</w:t>
+            </w:r>
+            <w:r>
+              <w:rPr>
+                <w:noProof/>
+                <w:webHidden/>
+              </w:rPr>
+              <w:tab/>
+            </w:r>
+            <w:r>
+              <w:rPr>
+                <w:noProof/>
+                <w:webHidden/>
+              </w:rPr>
+              <w:fldChar w:fldCharType="begin"/>
+            </w:r>
+            <w:r>
+              <w:rPr>
+                <w:noProof/>
+                <w:webHidden/>
+              </w:rPr>
+              <w:instrText xml:space="preserve"> PAGEREF _Toc226965364 \h </w:instrText>
+            </w:r>
+            <w:r>
+              <w:rPr>
+                <w:noProof/>
+                <w:webHidden/>
+              </w:rPr>
+            </w:r>
+            <w:r>
+              <w:rPr>
+                <w:noProof/>
+                <w:webHidden/>
+              </w:rPr>
+              <w:fldChar w:fldCharType="separate"/>
+            </w:r>
+            <w:r>
+              <w:rPr>
+                <w:noProof/>
+                <w:webHidden/>
+              </w:rPr>
+              <w:t>6</w:t>
+            </w:r>
+            <w:r>
+              <w:rPr>
+                <w:noProof/>
+                <w:webHidden/>
+              </w:rPr>
+              <w:fldChar w:fldCharType="end"/>
+            </w:r>
+          </w:hyperlink>
+        </w:p>
+        <w:p>
+          <w:pPr>
+            <w:pStyle w:val="TOC3"/>
+            <w:tabs>
+              <w:tab w:val="right" w:leader="dot" w:pos="9016"/>
+            </w:tabs>
+            <w:rPr>
+              <w:rFonts w:eastAsiaTheme="minorEastAsia"/>
+              <w:noProof/>
+              <w:sz w:val="24"/>
+              <w:szCs w:val="24"/>
+              <w:lang w:eastAsia="en-GB"/>
+            </w:rPr>
+          </w:pPr>
+          <w:hyperlink w:anchor="_Toc226965365" w:history="1">
+            <w:r>
+              <w:rPr>
+                <w:rStyle w:val="Hyperlink"/>
+                <w:noProof/>
+              </w:rPr>
+              <w:t>Figure 6. Volatility Table</w:t>
+            </w:r>
+            <w:r>
+              <w:rPr>
+                <w:noProof/>
+                <w:webHidden/>
+              </w:rPr>
+              <w:tab/>
+            </w:r>
+            <w:r>
+              <w:rPr>
+                <w:noProof/>
+                <w:webHidden/>
+              </w:rPr>
+              <w:fldChar w:fldCharType="begin"/>
+            </w:r>
+            <w:r>
+              <w:rPr>
+                <w:noProof/>
+                <w:webHidden/>
+              </w:rPr>
+              <w:instrText xml:space="preserve"> PAGEREF _Toc226965365 \h </w:instrText>
+            </w:r>
+            <w:r>
+              <w:rPr>
+                <w:noProof/>
+                <w:webHidden/>
+              </w:rPr>
+            </w:r>
+            <w:r>
+              <w:rPr>
+                <w:noProof/>
+                <w:webHidden/>
+              </w:rPr>
+              <w:fldChar w:fldCharType="separate"/>
+            </w:r>
+            <w:r>
+              <w:rPr>
+                <w:noProof/>
+                <w:webHidden/>
+              </w:rPr>
+              <w:t>7</w:t>
+            </w:r>
+            <w:r>
+              <w:rPr>
+                <w:noProof/>
+                <w:webHidden/>
+              </w:rPr>
+              <w:fldChar w:fldCharType="end"/>
+            </w:r>
+          </w:hyperlink>
+        </w:p>
+        <w:p>
+          <w:pPr>
+            <w:pStyle w:val="TOC3"/>
+            <w:tabs>
+              <w:tab w:val="right" w:leader="dot" w:pos="9016"/>
+            </w:tabs>
+            <w:rPr>
+              <w:rFonts w:eastAsiaTheme="minorEastAsia"/>
+              <w:noProof/>
+              <w:sz w:val="24"/>
+              <w:szCs w:val="24"/>
+              <w:lang w:eastAsia="en-GB"/>
+            </w:rPr>
+          </w:pPr>
+          <w:hyperlink w:anchor="_Toc226965366" w:history="1">
+            <w:r>
+              <w:rPr>
+                <w:rStyle w:val="Hyperlink"/>
+                <w:noProof/>
+              </w:rPr>
+              <w:t>Figure 7. Average Daily Returns Table</w:t>
+            </w:r>
+            <w:r>
+              <w:rPr>
+                <w:noProof/>
+                <w:webHidden/>
+              </w:rPr>
+              <w:tab/>
+            </w:r>
+            <w:r>
+              <w:rPr>
+                <w:noProof/>
+                <w:webHidden/>
+              </w:rPr>
+              <w:fldChar w:fldCharType="begin"/>
+            </w:r>
+            <w:r>
+              <w:rPr>
+                <w:noProof/>
+                <w:webHidden/>
+              </w:rPr>
+              <w:instrText xml:space="preserve"> PAGEREF _Toc226965366 \h </w:instrText>
+            </w:r>
+            <w:r>
+              <w:rPr>
+                <w:noProof/>
+                <w:webHidden/>
+              </w:rPr>
+            </w:r>
+            <w:r>
+              <w:rPr>
+                <w:noProof/>
+                <w:webHidden/>
+              </w:rPr>
+              <w:fldChar w:fldCharType="separate"/>
+            </w:r>
+            <w:r>
+              <w:rPr>
+                <w:noProof/>
+                <w:webHidden/>
+              </w:rPr>
+              <w:t>7</w:t>
+            </w:r>
+            <w:r>
+              <w:rPr>
+                <w:noProof/>
+                <w:webHidden/>
+              </w:rPr>
+              <w:fldChar w:fldCharType="end"/>
+            </w:r>
+          </w:hyperlink>
+        </w:p>
+        <w:p>
+          <w:pPr>
+            <w:pStyle w:val="TOC3"/>
+            <w:tabs>
+              <w:tab w:val="right" w:leader="dot" w:pos="9016"/>
+            </w:tabs>
+            <w:rPr>
+              <w:rFonts w:eastAsiaTheme="minorEastAsia"/>
+              <w:noProof/>
+              <w:sz w:val="24"/>
+              <w:szCs w:val="24"/>
+              <w:lang w:eastAsia="en-GB"/>
+            </w:rPr>
+          </w:pPr>
+          <w:hyperlink w:anchor="_Toc226965367" w:history="1">
+            <w:r>
+              <w:rPr>
+                <w:rStyle w:val="Hyperlink"/>
+                <w:noProof/>
+              </w:rPr>
+              <w:t>Figure 8. Summary Table</w:t>
+            </w:r>
+            <w:r>
+              <w:rPr>
+                <w:noProof/>
+                <w:webHidden/>
+              </w:rPr>
+              <w:tab/>
+            </w:r>
+            <w:r>
+              <w:rPr>
+                <w:noProof/>
+                <w:webHidden/>
+              </w:rPr>
+              <w:fldChar w:fldCharType="begin"/>
+            </w:r>
+            <w:r>
+              <w:rPr>
+                <w:noProof/>
+                <w:webHidden/>
+              </w:rPr>
+              <w:instrText xml:space="preserve"> PAGEREF _Toc226965367 \h </w:instrText>
+            </w:r>
+            <w:r>
+              <w:rPr>
+                <w:noProof/>
+                <w:webHidden/>
+              </w:rPr>
+            </w:r>
+            <w:r>
+              <w:rPr>
+                <w:noProof/>
+                <w:webHidden/>
+              </w:rPr>
+              <w:fldChar w:fldCharType="separate"/>
+            </w:r>
+            <w:r>
+              <w:rPr>
+                <w:noProof/>
+                <w:webHidden/>
+              </w:rPr>
+              <w:t>8</w:t>
+            </w:r>
+            <w:r>
+              <w:rPr>
+                <w:noProof/>
+                <w:webHidden/>
+              </w:rPr>
+              <w:fldChar w:fldCharType="end"/>
+            </w:r>
+          </w:hyperlink>
+        </w:p>
+        <w:p>
+          <w:pPr>
+            <w:pStyle w:val="TOC3"/>
+            <w:tabs>
+              <w:tab w:val="right" w:leader="dot" w:pos="9016"/>
+            </w:tabs>
+            <w:rPr>
+              <w:rFonts w:eastAsiaTheme="minorEastAsia"/>
+              <w:noProof/>
+              <w:sz w:val="24"/>
+              <w:szCs w:val="24"/>
+              <w:lang w:eastAsia="en-GB"/>
+            </w:rPr>
+          </w:pPr>
+          <w:hyperlink w:anchor="_Toc226965368" w:history="1">
+            <w:r>
+              <w:rPr>
+                <w:rStyle w:val="Hyperlink"/>
+                <w:noProof/>
+              </w:rPr>
+              <w:t>Figure 9. Graph 1 (Beta Vs Return)</w:t>
+            </w:r>
+            <w:r>
+              <w:rPr>
+                <w:noProof/>
+                <w:webHidden/>
+              </w:rPr>
+              <w:tab/>
+            </w:r>
+            <w:r>
+              <w:rPr>
+                <w:noProof/>
+                <w:webHidden/>
+              </w:rPr>
+              <w:fldChar w:fldCharType="begin"/>
+            </w:r>
+            <w:r>
+              <w:rPr>
+                <w:noProof/>
+                <w:webHidden/>
+              </w:rPr>
+              <w:instrText xml:space="preserve"> PAGEREF _Toc226965368 \h </w:instrText>
+            </w:r>
+            <w:r>
+              <w:rPr>
+                <w:noProof/>
+                <w:webHidden/>
+              </w:rPr>
+            </w:r>
+            <w:r>
+              <w:rPr>
+                <w:noProof/>
+                <w:webHidden/>
+              </w:rPr>
+              <w:fldChar w:fldCharType="separate"/>
+            </w:r>
+            <w:r>
+              <w:rPr>
+                <w:noProof/>
+                <w:webHidden/>
+              </w:rPr>
+              <w:t>9</w:t>
+            </w:r>
+            <w:r>
+              <w:rPr>
+                <w:noProof/>
+                <w:webHidden/>
+              </w:rPr>
+              <w:fldChar w:fldCharType="end"/>
+            </w:r>
+          </w:hyperlink>
+        </w:p>
+        <w:p>
+          <w:pPr>
+            <w:pStyle w:val="TOC3"/>
+            <w:tabs>
+              <w:tab w:val="right" w:leader="dot" w:pos="9016"/>
+            </w:tabs>
+            <w:rPr>
+              <w:rFonts w:eastAsiaTheme="minorEastAsia"/>
+              <w:noProof/>
+              <w:sz w:val="24"/>
+              <w:szCs w:val="24"/>
+              <w:lang w:eastAsia="en-GB"/>
+            </w:rPr>
+          </w:pPr>
+          <w:hyperlink w:anchor="_Toc226965369" w:history="1">
+            <w:r>
+              <w:rPr>
+                <w:rStyle w:val="Hyperlink"/>
+                <w:noProof/>
+              </w:rPr>
+              <w:t>Figure 10. Graph 2 (Volatility Distribution)</w:t>
+            </w:r>
+            <w:r>
+              <w:rPr>
+                <w:noProof/>
+                <w:webHidden/>
+              </w:rPr>
+              <w:tab/>
+            </w:r>
+            <w:r>
+              <w:rPr>
+                <w:noProof/>
+                <w:webHidden/>
+              </w:rPr>
+              <w:fldChar w:fldCharType="begin"/>
+            </w:r>
+            <w:r>
+              <w:rPr>
+                <w:noProof/>
+                <w:webHidden/>
+              </w:rPr>
+              <w:instrText xml:space="preserve"> PAGEREF _Toc226965369 \h </w:instrText>
+            </w:r>
+            <w:r>
+              <w:rPr>
+                <w:noProof/>
+                <w:webHidden/>
+              </w:rPr>
+            </w:r>
+            <w:r>
+              <w:rPr>
+                <w:noProof/>
+                <w:webHidden/>
+              </w:rPr>
+              <w:fldChar w:fldCharType="separate"/>
+            </w:r>
+            <w:r>
+              <w:rPr>
+                <w:noProof/>
+                <w:webHidden/>
+              </w:rPr>
+              <w:t>10</w:t>
+            </w:r>
+            <w:r>
+              <w:rPr>
+                <w:noProof/>
+                <w:webHidden/>
+              </w:rPr>
+              <w:fldChar w:fldCharType="end"/>
+            </w:r>
+          </w:hyperlink>
+        </w:p>
+        <w:p>
+          <w:pPr>
+            <w:pStyle w:val="TOC1"/>
+            <w:tabs>
+              <w:tab w:val="right" w:leader="dot" w:pos="9016"/>
+            </w:tabs>
+            <w:rPr>
+              <w:rFonts w:eastAsiaTheme="minorEastAsia"/>
+              <w:b w:val="0"/>
+              <w:bCs w:val="0"/>
+              <w:i w:val="0"/>
+              <w:iCs w:val="0"/>
+              <w:noProof/>
+              <w:lang w:eastAsia="en-GB"/>
+            </w:rPr>
+          </w:pPr>
+          <w:hyperlink w:anchor="_Toc226965370" w:history="1">
+            <w:r>
+              <w:rPr>
+                <w:rStyle w:val="Hyperlink"/>
+                <w:noProof/>
+              </w:rPr>
+              <w:t>Data Collection and Analysis</w:t>
+            </w:r>
+            <w:r>
+              <w:rPr>
+                <w:noProof/>
+                <w:webHidden/>
+              </w:rPr>
+              <w:tab/>
+            </w:r>
+            <w:r>
+              <w:rPr>
+                <w:noProof/>
+                <w:webHidden/>
+              </w:rPr>
+              <w:fldChar w:fldCharType="begin"/>
+            </w:r>
+            <w:r>
+              <w:rPr>
+                <w:noProof/>
+                <w:webHidden/>
+              </w:rPr>
+              <w:instrText xml:space="preserve"> PAGEREF _Toc226965370 \h </w:instrText>
+            </w:r>
+            <w:r>
+              <w:rPr>
+                <w:noProof/>
+                <w:webHidden/>
+              </w:rPr>
+            </w:r>
+            <w:r>
+              <w:rPr>
+                <w:noProof/>
+                <w:webHidden/>
+              </w:rPr>
+              <w:fldChar w:fldCharType="separate"/>
+            </w:r>
+            <w:r>
+              <w:rPr>
+                <w:noProof/>
+                <w:webHidden/>
+              </w:rPr>
+              <w:t>10</w:t>
             </w:r>
             <w:r>
               <w:rPr>
@@ -221,13 +1016,13 @@
               <w:lang w:eastAsia="en-GB"/>
             </w:rPr>
           </w:pPr>
-          <w:hyperlink w:anchor="_Toc226212759" w:history="1">
+          <w:hyperlink w:anchor="_Toc226965371" w:history="1">
             <w:r>
               <w:rPr>
                 <w:rStyle w:val="Hyperlink"/>
                 <w:noProof/>
               </w:rPr>
-              <w:t>Figure 1-Tickers List</w:t>
+              <w:t>Data Collection</w:t>
             </w:r>
             <w:r>
               <w:rPr>
@@ -248,7 +1043,7 @@
                 <w:noProof/>
                 <w:webHidden/>
               </w:rPr>
-              <w:instrText xml:space="preserve"> PAGEREF _Toc226212759 \h </w:instrText>
+              <w:instrText xml:space="preserve"> PAGEREF _Toc226965371 \h </w:instrText>
             </w:r>
             <w:r>
               <w:rPr>
@@ -268,7 +1063,7 @@
                 <w:noProof/>
                 <w:webHidden/>
               </w:rPr>
-              <w:t>2</w:t>
+              <w:t>10</w:t>
             </w:r>
             <w:r>
               <w:rPr>
@@ -295,13 +1090,13 @@
               <w:lang w:eastAsia="en-GB"/>
             </w:rPr>
           </w:pPr>
-          <w:hyperlink w:anchor="_Toc226212760" w:history="1">
+          <w:hyperlink w:anchor="_Toc226965372" w:history="1">
             <w:r>
               <w:rPr>
                 <w:rStyle w:val="Hyperlink"/>
                 <w:noProof/>
               </w:rPr>
-              <w:t>Figure 2-Dataset Shape</w:t>
+              <w:t>Data Cleaning</w:t>
             </w:r>
             <w:r>
               <w:rPr>
@@ -322,7 +1117,7 @@
                 <w:noProof/>
                 <w:webHidden/>
               </w:rPr>
-              <w:instrText xml:space="preserve"> PAGEREF _Toc226212760 \h </w:instrText>
+              <w:instrText xml:space="preserve"> PAGEREF _Toc226965372 \h </w:instrText>
             </w:r>
             <w:r>
               <w:rPr>
@@ -342,7 +1137,7 @@
                 <w:noProof/>
                 <w:webHidden/>
               </w:rPr>
-              <w:t>2</w:t>
+              <w:t>11</w:t>
             </w:r>
             <w:r>
               <w:rPr>
@@ -369,13 +1164,13 @@
               <w:lang w:eastAsia="en-GB"/>
             </w:rPr>
           </w:pPr>
-          <w:hyperlink w:anchor="_Toc226212761" w:history="1">
+          <w:hyperlink w:anchor="_Toc226965373" w:history="1">
             <w:r>
               <w:rPr>
                 <w:rStyle w:val="Hyperlink"/>
                 <w:noProof/>
               </w:rPr>
-              <w:t>Figure 3-Cleaning (Before &amp; After)</w:t>
+              <w:t>Return Calculation</w:t>
             </w:r>
             <w:r>
               <w:rPr>
@@ -396,7 +1191,7 @@
                 <w:noProof/>
                 <w:webHidden/>
               </w:rPr>
-              <w:instrText xml:space="preserve"> PAGEREF _Toc226212761 \h </w:instrText>
+              <w:instrText xml:space="preserve"> PAGEREF _Toc226965373 \h </w:instrText>
             </w:r>
             <w:r>
               <w:rPr>
@@ -416,7 +1211,7 @@
                 <w:noProof/>
                 <w:webHidden/>
               </w:rPr>
-              <w:t>2</w:t>
+              <w:t>11</w:t>
             </w:r>
             <w:r>
               <w:rPr>
@@ -443,13 +1238,13 @@
               <w:lang w:eastAsia="en-GB"/>
             </w:rPr>
           </w:pPr>
-          <w:hyperlink w:anchor="_Toc226212762" w:history="1">
+          <w:hyperlink w:anchor="_Toc226965374" w:history="1">
             <w:r>
               <w:rPr>
                 <w:rStyle w:val="Hyperlink"/>
                 <w:noProof/>
               </w:rPr>
-              <w:t>Figure 4-Daily Returns</w:t>
+              <w:t>Beta Calculation</w:t>
             </w:r>
             <w:r>
               <w:rPr>
@@ -470,7 +1265,7 @@
                 <w:noProof/>
                 <w:webHidden/>
               </w:rPr>
-              <w:instrText xml:space="preserve"> PAGEREF _Toc226212762 \h </w:instrText>
+              <w:instrText xml:space="preserve"> PAGEREF _Toc226965374 \h </w:instrText>
             </w:r>
             <w:r>
               <w:rPr>
@@ -490,7 +1285,7 @@
                 <w:noProof/>
                 <w:webHidden/>
               </w:rPr>
-              <w:t>3</w:t>
+              <w:t>11</w:t>
             </w:r>
             <w:r>
               <w:rPr>
@@ -517,13 +1312,13 @@
               <w:lang w:eastAsia="en-GB"/>
             </w:rPr>
           </w:pPr>
-          <w:hyperlink w:anchor="_Toc226212763" w:history="1">
+          <w:hyperlink w:anchor="_Toc226965375" w:history="1">
             <w:r>
               <w:rPr>
                 <w:rStyle w:val="Hyperlink"/>
                 <w:noProof/>
               </w:rPr>
-              <w:t>Figure 5-Beta Table</w:t>
+              <w:t>Volatility Calculation</w:t>
             </w:r>
             <w:r>
               <w:rPr>
@@ -544,7 +1339,7 @@
                 <w:noProof/>
                 <w:webHidden/>
               </w:rPr>
-              <w:instrText xml:space="preserve"> PAGEREF _Toc226212763 \h </w:instrText>
+              <w:instrText xml:space="preserve"> PAGEREF _Toc226965375 \h </w:instrText>
             </w:r>
             <w:r>
               <w:rPr>
@@ -564,7 +1359,7 @@
                 <w:noProof/>
                 <w:webHidden/>
               </w:rPr>
-              <w:t>3</w:t>
+              <w:t>11</w:t>
             </w:r>
             <w:r>
               <w:rPr>
@@ -591,13 +1386,13 @@
               <w:lang w:eastAsia="en-GB"/>
             </w:rPr>
           </w:pPr>
-          <w:hyperlink w:anchor="_Toc226212764" w:history="1">
+          <w:hyperlink w:anchor="_Toc226965376" w:history="1">
             <w:r>
               <w:rPr>
                 <w:rStyle w:val="Hyperlink"/>
                 <w:noProof/>
               </w:rPr>
-              <w:t>Figure 6-Volatility Table</w:t>
+              <w:t>Summary Metrics</w:t>
             </w:r>
             <w:r>
               <w:rPr>
@@ -618,7 +1413,7 @@
                 <w:noProof/>
                 <w:webHidden/>
               </w:rPr>
-              <w:instrText xml:space="preserve"> PAGEREF _Toc226212764 \h </w:instrText>
+              <w:instrText xml:space="preserve"> PAGEREF _Toc226965376 \h </w:instrText>
             </w:r>
             <w:r>
               <w:rPr>
@@ -638,7 +1433,7 @@
                 <w:noProof/>
                 <w:webHidden/>
               </w:rPr>
-              <w:t>4</w:t>
+              <w:t>11</w:t>
             </w:r>
             <w:r>
               <w:rPr>
@@ -665,13 +1460,13 @@
               <w:lang w:eastAsia="en-GB"/>
             </w:rPr>
           </w:pPr>
-          <w:hyperlink w:anchor="_Toc226212765" w:history="1">
+          <w:hyperlink w:anchor="_Toc226965377" w:history="1">
             <w:r>
               <w:rPr>
                 <w:rStyle w:val="Hyperlink"/>
                 <w:noProof/>
               </w:rPr>
-              <w:t>Figure 7-Average Daily Returns Table</w:t>
+              <w:t>Visual Analysis</w:t>
             </w:r>
             <w:r>
               <w:rPr>
@@ -692,7 +1487,7 @@
                 <w:noProof/>
                 <w:webHidden/>
               </w:rPr>
-              <w:instrText xml:space="preserve"> PAGEREF _Toc226212765 \h </w:instrText>
+              <w:instrText xml:space="preserve"> PAGEREF _Toc226965377 \h </w:instrText>
             </w:r>
             <w:r>
               <w:rPr>
@@ -712,7 +1507,155 @@
                 <w:noProof/>
                 <w:webHidden/>
               </w:rPr>
-              <w:t>4</w:t>
+              <w:t>12</w:t>
+            </w:r>
+            <w:r>
+              <w:rPr>
+                <w:noProof/>
+                <w:webHidden/>
+              </w:rPr>
+              <w:fldChar w:fldCharType="end"/>
+            </w:r>
+          </w:hyperlink>
+        </w:p>
+        <w:p>
+          <w:pPr>
+            <w:pStyle w:val="TOC1"/>
+            <w:tabs>
+              <w:tab w:val="right" w:leader="dot" w:pos="9016"/>
+            </w:tabs>
+            <w:rPr>
+              <w:rFonts w:eastAsiaTheme="minorEastAsia"/>
+              <w:b w:val="0"/>
+              <w:bCs w:val="0"/>
+              <w:i w:val="0"/>
+              <w:iCs w:val="0"/>
+              <w:noProof/>
+              <w:lang w:eastAsia="en-GB"/>
+            </w:rPr>
+          </w:pPr>
+          <w:hyperlink w:anchor="_Toc226965378" w:history="1">
+            <w:r>
+              <w:rPr>
+                <w:rStyle w:val="Hyperlink"/>
+                <w:noProof/>
+              </w:rPr>
+              <w:t>Task B</w:t>
+            </w:r>
+            <w:r>
+              <w:rPr>
+                <w:noProof/>
+                <w:webHidden/>
+              </w:rPr>
+              <w:tab/>
+            </w:r>
+            <w:r>
+              <w:rPr>
+                <w:noProof/>
+                <w:webHidden/>
+              </w:rPr>
+              <w:fldChar w:fldCharType="begin"/>
+            </w:r>
+            <w:r>
+              <w:rPr>
+                <w:noProof/>
+                <w:webHidden/>
+              </w:rPr>
+              <w:instrText xml:space="preserve"> PAGEREF _Toc226965378 \h </w:instrText>
+            </w:r>
+            <w:r>
+              <w:rPr>
+                <w:noProof/>
+                <w:webHidden/>
+              </w:rPr>
+            </w:r>
+            <w:r>
+              <w:rPr>
+                <w:noProof/>
+                <w:webHidden/>
+              </w:rPr>
+              <w:fldChar w:fldCharType="separate"/>
+            </w:r>
+            <w:r>
+              <w:rPr>
+                <w:noProof/>
+                <w:webHidden/>
+              </w:rPr>
+              <w:t>12</w:t>
+            </w:r>
+            <w:r>
+              <w:rPr>
+                <w:noProof/>
+                <w:webHidden/>
+              </w:rPr>
+              <w:fldChar w:fldCharType="end"/>
+            </w:r>
+          </w:hyperlink>
+        </w:p>
+        <w:p>
+          <w:pPr>
+            <w:pStyle w:val="TOC1"/>
+            <w:tabs>
+              <w:tab w:val="right" w:leader="dot" w:pos="9016"/>
+            </w:tabs>
+            <w:rPr>
+              <w:rFonts w:eastAsiaTheme="minorEastAsia"/>
+              <w:b w:val="0"/>
+              <w:bCs w:val="0"/>
+              <w:i w:val="0"/>
+              <w:iCs w:val="0"/>
+              <w:noProof/>
+              <w:lang w:eastAsia="en-GB"/>
+            </w:rPr>
+          </w:pPr>
+          <w:hyperlink w:anchor="_Toc226965379" w:history="1">
+            <w:r>
+              <w:rPr>
+                <w:rStyle w:val="Hyperlink"/>
+                <w:noProof/>
+              </w:rPr>
+              <w:t>Agglomerative Clustering</w:t>
+            </w:r>
+            <w:r>
+              <w:rPr>
+                <w:noProof/>
+                <w:webHidden/>
+              </w:rPr>
+              <w:tab/>
+            </w:r>
+            <w:r>
+              <w:rPr>
+                <w:noProof/>
+                <w:webHidden/>
+              </w:rPr>
+              <w:fldChar w:fldCharType="begin"/>
+            </w:r>
+            <w:r>
+              <w:rPr>
+                <w:noProof/>
+                <w:webHidden/>
+              </w:rPr>
+              <w:instrText xml:space="preserve"> PAGEREF _Toc226965379 \h </w:instrText>
+            </w:r>
+            <w:r>
+              <w:rPr>
+                <w:noProof/>
+                <w:webHidden/>
+              </w:rPr>
+            </w:r>
+            <w:r>
+              <w:rPr>
+                <w:noProof/>
+                <w:webHidden/>
+              </w:rPr>
+              <w:fldChar w:fldCharType="separate"/>
+            </w:r>
+            <w:r>
+              <w:rPr>
+                <w:noProof/>
+                <w:webHidden/>
+              </w:rPr>
+              <w:t>12</w:t>
             </w:r>
             <w:r>
               <w:rPr>
@@ -739,13 +1682,13 @@
               <w:lang w:eastAsia="en-GB"/>
             </w:rPr>
           </w:pPr>
-          <w:hyperlink w:anchor="_Toc226212766" w:history="1">
+          <w:hyperlink w:anchor="_Toc226965380" w:history="1">
             <w:r>
               <w:rPr>
                 <w:rStyle w:val="Hyperlink"/>
                 <w:noProof/>
               </w:rPr>
-              <w:t>Figure 8-Summary Table</w:t>
+              <w:t>Appropriateness of Agglomerative clustering</w:t>
             </w:r>
             <w:r>
               <w:rPr>
@@ -766,7 +1709,7 @@
                 <w:noProof/>
                 <w:webHidden/>
               </w:rPr>
-              <w:instrText xml:space="preserve"> PAGEREF _Toc226212766 \h </w:instrText>
+              <w:instrText xml:space="preserve"> PAGEREF _Toc226965380 \h </w:instrText>
             </w:r>
             <w:r>
               <w:rPr>
@@ -786,7 +1729,7 @@
                 <w:noProof/>
                 <w:webHidden/>
               </w:rPr>
-              <w:t>5</w:t>
+              <w:t>12</w:t>
             </w:r>
             <w:r>
               <w:rPr>
@@ -813,13 +1756,13 @@
               <w:lang w:eastAsia="en-GB"/>
             </w:rPr>
           </w:pPr>
-          <w:hyperlink w:anchor="_Toc226212767" w:history="1">
+          <w:hyperlink w:anchor="_Toc226965381" w:history="1">
             <w:r>
               <w:rPr>
                 <w:rStyle w:val="Hyperlink"/>
                 <w:noProof/>
               </w:rPr>
-              <w:t>Figure 9-Graph 1 (Beta Vs Return)</w:t>
+              <w:t>Agglomerative Clustering Implementation</w:t>
             </w:r>
             <w:r>
               <w:rPr>
@@ -840,7 +1783,7 @@
                 <w:noProof/>
                 <w:webHidden/>
               </w:rPr>
-              <w:instrText xml:space="preserve"> PAGEREF _Toc226212767 \h </w:instrText>
+              <w:instrText xml:space="preserve"> PAGEREF _Toc226965381 \h </w:instrText>
             </w:r>
             <w:r>
               <w:rPr>
@@ -860,7 +1803,225 @@
                 <w:noProof/>
                 <w:webHidden/>
               </w:rPr>
-              <w:t>5</w:t>
+              <w:t>13</w:t>
+            </w:r>
+            <w:r>
+              <w:rPr>
+                <w:noProof/>
+                <w:webHidden/>
+              </w:rPr>
+              <w:fldChar w:fldCharType="end"/>
+            </w:r>
+          </w:hyperlink>
+        </w:p>
+        <w:p>
+          <w:pPr>
+            <w:pStyle w:val="TOC3"/>
+            <w:tabs>
+              <w:tab w:val="right" w:leader="dot" w:pos="9016"/>
+            </w:tabs>
+            <w:rPr>
+              <w:rFonts w:eastAsiaTheme="minorEastAsia"/>
+              <w:noProof/>
+              <w:sz w:val="24"/>
+              <w:szCs w:val="24"/>
+              <w:lang w:eastAsia="en-GB"/>
+            </w:rPr>
+          </w:pPr>
+          <w:hyperlink w:anchor="_Toc226965382" w:history="1">
+            <w:r>
+              <w:rPr>
+                <w:rStyle w:val="Hyperlink"/>
+                <w:noProof/>
+              </w:rPr>
+              <w:t>Figure 11. Silhouette plot for 2-9 clusters</w:t>
+            </w:r>
+            <w:r>
+              <w:rPr>
+                <w:noProof/>
+                <w:webHidden/>
+              </w:rPr>
+              <w:tab/>
+            </w:r>
+            <w:r>
+              <w:rPr>
+                <w:noProof/>
+                <w:webHidden/>
+              </w:rPr>
+              <w:fldChar w:fldCharType="begin"/>
+            </w:r>
+            <w:r>
+              <w:rPr>
+                <w:noProof/>
+                <w:webHidden/>
+              </w:rPr>
+              <w:instrText xml:space="preserve"> PAGEREF _Toc226965382 \h </w:instrText>
+            </w:r>
+            <w:r>
+              <w:rPr>
+                <w:noProof/>
+                <w:webHidden/>
+              </w:rPr>
+            </w:r>
+            <w:r>
+              <w:rPr>
+                <w:noProof/>
+                <w:webHidden/>
+              </w:rPr>
+              <w:fldChar w:fldCharType="separate"/>
+            </w:r>
+            <w:r>
+              <w:rPr>
+                <w:noProof/>
+                <w:webHidden/>
+              </w:rPr>
+              <w:t>14</w:t>
+            </w:r>
+            <w:r>
+              <w:rPr>
+                <w:noProof/>
+                <w:webHidden/>
+              </w:rPr>
+              <w:fldChar w:fldCharType="end"/>
+            </w:r>
+          </w:hyperlink>
+        </w:p>
+        <w:p>
+          <w:pPr>
+            <w:pStyle w:val="TOC3"/>
+            <w:tabs>
+              <w:tab w:val="right" w:leader="dot" w:pos="9016"/>
+            </w:tabs>
+            <w:rPr>
+              <w:rFonts w:eastAsiaTheme="minorEastAsia"/>
+              <w:noProof/>
+              <w:sz w:val="24"/>
+              <w:szCs w:val="24"/>
+              <w:lang w:eastAsia="en-GB"/>
+            </w:rPr>
+          </w:pPr>
+          <w:hyperlink w:anchor="_Toc226965383" w:history="1">
+            <w:r>
+              <w:rPr>
+                <w:rStyle w:val="Hyperlink"/>
+                <w:noProof/>
+              </w:rPr>
+              <w:t>Figure 12. Plot for k=4 cluster segmentation.</w:t>
+            </w:r>
+            <w:r>
+              <w:rPr>
+                <w:noProof/>
+                <w:webHidden/>
+              </w:rPr>
+              <w:tab/>
+            </w:r>
+            <w:r>
+              <w:rPr>
+                <w:noProof/>
+                <w:webHidden/>
+              </w:rPr>
+              <w:fldChar w:fldCharType="begin"/>
+            </w:r>
+            <w:r>
+              <w:rPr>
+                <w:noProof/>
+                <w:webHidden/>
+              </w:rPr>
+              <w:instrText xml:space="preserve"> PAGEREF _Toc226965383 \h </w:instrText>
+            </w:r>
+            <w:r>
+              <w:rPr>
+                <w:noProof/>
+                <w:webHidden/>
+              </w:rPr>
+            </w:r>
+            <w:r>
+              <w:rPr>
+                <w:noProof/>
+                <w:webHidden/>
+              </w:rPr>
+              <w:fldChar w:fldCharType="separate"/>
+            </w:r>
+            <w:r>
+              <w:rPr>
+                <w:noProof/>
+                <w:webHidden/>
+              </w:rPr>
+              <w:t>14</w:t>
+            </w:r>
+            <w:r>
+              <w:rPr>
+                <w:noProof/>
+                <w:webHidden/>
+              </w:rPr>
+              <w:fldChar w:fldCharType="end"/>
+            </w:r>
+          </w:hyperlink>
+        </w:p>
+        <w:p>
+          <w:pPr>
+            <w:pStyle w:val="TOC1"/>
+            <w:tabs>
+              <w:tab w:val="right" w:leader="dot" w:pos="9016"/>
+            </w:tabs>
+            <w:rPr>
+              <w:rFonts w:eastAsiaTheme="minorEastAsia"/>
+              <w:b w:val="0"/>
+              <w:bCs w:val="0"/>
+              <w:i w:val="0"/>
+              <w:iCs w:val="0"/>
+              <w:noProof/>
+              <w:lang w:eastAsia="en-GB"/>
+            </w:rPr>
+          </w:pPr>
+          <w:hyperlink w:anchor="_Toc226965384" w:history="1">
+            <w:r>
+              <w:rPr>
+                <w:rStyle w:val="Hyperlink"/>
+                <w:noProof/>
+              </w:rPr>
+              <w:t>K-means Clustering</w:t>
+            </w:r>
+            <w:r>
+              <w:rPr>
+                <w:noProof/>
+                <w:webHidden/>
+              </w:rPr>
+              <w:tab/>
+            </w:r>
+            <w:r>
+              <w:rPr>
+                <w:noProof/>
+                <w:webHidden/>
+              </w:rPr>
+              <w:fldChar w:fldCharType="begin"/>
+            </w:r>
+            <w:r>
+              <w:rPr>
+                <w:noProof/>
+                <w:webHidden/>
+              </w:rPr>
+              <w:instrText xml:space="preserve"> PAGEREF _Toc226965384 \h </w:instrText>
+            </w:r>
+            <w:r>
+              <w:rPr>
+                <w:noProof/>
+                <w:webHidden/>
+              </w:rPr>
+            </w:r>
+            <w:r>
+              <w:rPr>
+                <w:noProof/>
+                <w:webHidden/>
+              </w:rPr>
+              <w:fldChar w:fldCharType="separate"/>
+            </w:r>
+            <w:r>
+              <w:rPr>
+                <w:noProof/>
+                <w:webHidden/>
+              </w:rPr>
+              <w:t>15</w:t>
             </w:r>
             <w:r>
               <w:rPr>
@@ -887,13 +2048,13 @@
               <w:lang w:eastAsia="en-GB"/>
             </w:rPr>
           </w:pPr>
-          <w:hyperlink w:anchor="_Toc226212768" w:history="1">
+          <w:hyperlink w:anchor="_Toc226965385" w:history="1">
             <w:r>
               <w:rPr>
                 <w:rStyle w:val="Hyperlink"/>
                 <w:noProof/>
               </w:rPr>
-              <w:t>Figure 10-Graph 2 (Volatility Distribution)</w:t>
+              <w:t>Appropriateness of K-means clustering</w:t>
             </w:r>
             <w:r>
               <w:rPr>
@@ -914,7 +2075,7 @@
                 <w:noProof/>
                 <w:webHidden/>
               </w:rPr>
-              <w:instrText xml:space="preserve"> PAGEREF _Toc226212768 \h </w:instrText>
+              <w:instrText xml:space="preserve"> PAGEREF _Toc226965385 \h </w:instrText>
             </w:r>
             <w:r>
               <w:rPr>
@@ -934,81 +2095,7 @@
                 <w:noProof/>
                 <w:webHidden/>
               </w:rPr>
-              <w:t>6</w:t>
-            </w:r>
-            <w:r>
-              <w:rPr>
-                <w:noProof/>
-                <w:webHidden/>
-              </w:rPr>
-              <w:fldChar w:fldCharType="end"/>
-            </w:r>
-          </w:hyperlink>
-        </w:p>
-        <w:p>
-          <w:pPr>
-            <w:pStyle w:val="TOC1"/>
-            <w:tabs>
-              <w:tab w:val="right" w:leader="dot" w:pos="9016"/>
-            </w:tabs>
-            <w:rPr>
-              <w:rFonts w:eastAsiaTheme="minorEastAsia"/>
-              <w:b w:val="0"/>
-              <w:bCs w:val="0"/>
-              <w:i w:val="0"/>
-              <w:iCs w:val="0"/>
-              <w:noProof/>
-              <w:lang w:eastAsia="en-GB"/>
-            </w:rPr>
-          </w:pPr>
-          <w:hyperlink w:anchor="_Toc226212769" w:history="1">
-            <w:r>
-              <w:rPr>
-                <w:rStyle w:val="Hyperlink"/>
-                <w:noProof/>
-              </w:rPr>
-              <w:t>Data Collection and Analysis</w:t>
-            </w:r>
-            <w:r>
-              <w:rPr>
-                <w:noProof/>
-                <w:webHidden/>
-              </w:rPr>
-              <w:tab/>
-            </w:r>
-            <w:r>
-              <w:rPr>
-                <w:noProof/>
-                <w:webHidden/>
-              </w:rPr>
-              <w:fldChar w:fldCharType="begin"/>
-            </w:r>
-            <w:r>
-              <w:rPr>
-                <w:noProof/>
-                <w:webHidden/>
-              </w:rPr>
-              <w:instrText xml:space="preserve"> PAGEREF _Toc226212769 \h </w:instrText>
-            </w:r>
-            <w:r>
-              <w:rPr>
-                <w:noProof/>
-                <w:webHidden/>
-              </w:rPr>
-            </w:r>
-            <w:r>
-              <w:rPr>
-                <w:noProof/>
-                <w:webHidden/>
-              </w:rPr>
-              <w:fldChar w:fldCharType="separate"/>
-            </w:r>
-            <w:r>
-              <w:rPr>
-                <w:noProof/>
-                <w:webHidden/>
-              </w:rPr>
-              <w:t>6</w:t>
+              <w:t>15</w:t>
             </w:r>
             <w:r>
               <w:rPr>
@@ -1035,13 +2122,13 @@
               <w:lang w:eastAsia="en-GB"/>
             </w:rPr>
           </w:pPr>
-          <w:hyperlink w:anchor="_Toc226212770" w:history="1">
+          <w:hyperlink w:anchor="_Toc226965386" w:history="1">
             <w:r>
               <w:rPr>
                 <w:rStyle w:val="Hyperlink"/>
                 <w:noProof/>
               </w:rPr>
-              <w:t>Data Collection</w:t>
+              <w:t>Remove Skewness and Scaling</w:t>
             </w:r>
             <w:r>
               <w:rPr>
@@ -1062,7 +2149,7 @@
                 <w:noProof/>
                 <w:webHidden/>
               </w:rPr>
-              <w:instrText xml:space="preserve"> PAGEREF _Toc226212770 \h </w:instrText>
+              <w:instrText xml:space="preserve"> PAGEREF _Toc226965386 \h </w:instrText>
             </w:r>
             <w:r>
               <w:rPr>
@@ -1082,7 +2169,151 @@
                 <w:noProof/>
                 <w:webHidden/>
               </w:rPr>
-              <w:t>6</w:t>
+              <w:t>16</w:t>
+            </w:r>
+            <w:r>
+              <w:rPr>
+                <w:noProof/>
+                <w:webHidden/>
+              </w:rPr>
+              <w:fldChar w:fldCharType="end"/>
+            </w:r>
+          </w:hyperlink>
+        </w:p>
+        <w:p>
+          <w:pPr>
+            <w:pStyle w:val="TOC3"/>
+            <w:tabs>
+              <w:tab w:val="right" w:leader="dot" w:pos="9016"/>
+            </w:tabs>
+            <w:rPr>
+              <w:rFonts w:eastAsiaTheme="minorEastAsia"/>
+              <w:noProof/>
+              <w:sz w:val="24"/>
+              <w:szCs w:val="24"/>
+              <w:lang w:eastAsia="en-GB"/>
+            </w:rPr>
+          </w:pPr>
+          <w:hyperlink w:anchor="_Toc226965387" w:history="1">
+            <w:r>
+              <w:rPr>
+                <w:rStyle w:val="Hyperlink"/>
+                <w:noProof/>
+              </w:rPr>
+              <w:t>Figure 13. Histogram of distribution of input data before normalisation.</w:t>
+            </w:r>
+            <w:r>
+              <w:rPr>
+                <w:noProof/>
+                <w:webHidden/>
+              </w:rPr>
+              <w:tab/>
+            </w:r>
+            <w:r>
+              <w:rPr>
+                <w:noProof/>
+                <w:webHidden/>
+              </w:rPr>
+              <w:fldChar w:fldCharType="begin"/>
+            </w:r>
+            <w:r>
+              <w:rPr>
+                <w:noProof/>
+                <w:webHidden/>
+              </w:rPr>
+              <w:instrText xml:space="preserve"> PAGEREF _Toc226965387 \h </w:instrText>
+            </w:r>
+            <w:r>
+              <w:rPr>
+                <w:noProof/>
+                <w:webHidden/>
+              </w:rPr>
+            </w:r>
+            <w:r>
+              <w:rPr>
+                <w:noProof/>
+                <w:webHidden/>
+              </w:rPr>
+              <w:fldChar w:fldCharType="separate"/>
+            </w:r>
+            <w:r>
+              <w:rPr>
+                <w:noProof/>
+                <w:webHidden/>
+              </w:rPr>
+              <w:t>17</w:t>
+            </w:r>
+            <w:r>
+              <w:rPr>
+                <w:noProof/>
+                <w:webHidden/>
+              </w:rPr>
+              <w:fldChar w:fldCharType="end"/>
+            </w:r>
+          </w:hyperlink>
+        </w:p>
+        <w:p>
+          <w:pPr>
+            <w:pStyle w:val="TOC3"/>
+            <w:tabs>
+              <w:tab w:val="right" w:leader="dot" w:pos="9016"/>
+            </w:tabs>
+            <w:rPr>
+              <w:rFonts w:eastAsiaTheme="minorEastAsia"/>
+              <w:noProof/>
+              <w:sz w:val="24"/>
+              <w:szCs w:val="24"/>
+              <w:lang w:eastAsia="en-GB"/>
+            </w:rPr>
+          </w:pPr>
+          <w:hyperlink w:anchor="_Toc226965388" w:history="1">
+            <w:r>
+              <w:rPr>
+                <w:rStyle w:val="Hyperlink"/>
+                <w:noProof/>
+              </w:rPr>
+              <w:t>Figure 14. Distribution of input data prior to normalisation.</w:t>
+            </w:r>
+            <w:r>
+              <w:rPr>
+                <w:noProof/>
+                <w:webHidden/>
+              </w:rPr>
+              <w:tab/>
+            </w:r>
+            <w:r>
+              <w:rPr>
+                <w:noProof/>
+                <w:webHidden/>
+              </w:rPr>
+              <w:fldChar w:fldCharType="begin"/>
+            </w:r>
+            <w:r>
+              <w:rPr>
+                <w:noProof/>
+                <w:webHidden/>
+              </w:rPr>
+              <w:instrText xml:space="preserve"> PAGEREF _Toc226965388 \h </w:instrText>
+            </w:r>
+            <w:r>
+              <w:rPr>
+                <w:noProof/>
+                <w:webHidden/>
+              </w:rPr>
+            </w:r>
+            <w:r>
+              <w:rPr>
+                <w:noProof/>
+                <w:webHidden/>
+              </w:rPr>
+              <w:fldChar w:fldCharType="separate"/>
+            </w:r>
+            <w:r>
+              <w:rPr>
+                <w:noProof/>
+                <w:webHidden/>
+              </w:rPr>
+              <w:t>18</w:t>
             </w:r>
             <w:r>
               <w:rPr>
@@ -1109,13 +2340,13 @@
               <w:lang w:eastAsia="en-GB"/>
             </w:rPr>
           </w:pPr>
-          <w:hyperlink w:anchor="_Toc226212771" w:history="1">
+          <w:hyperlink w:anchor="_Toc226965389" w:history="1">
             <w:r>
               <w:rPr>
                 <w:rStyle w:val="Hyperlink"/>
                 <w:noProof/>
               </w:rPr>
-              <w:t>Data Cleaning</w:t>
+              <w:t>K-means Clustering Implementation</w:t>
             </w:r>
             <w:r>
               <w:rPr>
@@ -1136,7 +2367,7 @@
                 <w:noProof/>
                 <w:webHidden/>
               </w:rPr>
-              <w:instrText xml:space="preserve"> PAGEREF _Toc226212771 \h </w:instrText>
+              <w:instrText xml:space="preserve"> PAGEREF _Toc226965389 \h </w:instrText>
             </w:r>
             <w:r>
               <w:rPr>
@@ -1156,7 +2387,7 @@
                 <w:noProof/>
                 <w:webHidden/>
               </w:rPr>
-              <w:t>6</w:t>
+              <w:t>19</w:t>
             </w:r>
             <w:r>
               <w:rPr>
@@ -1169,27 +2400,25 @@
         </w:p>
         <w:p>
           <w:pPr>
-            <w:pStyle w:val="TOC2"/>
+            <w:pStyle w:val="TOC3"/>
             <w:tabs>
               <w:tab w:val="right" w:leader="dot" w:pos="9016"/>
             </w:tabs>
             <w:rPr>
               <w:rFonts w:eastAsiaTheme="minorEastAsia"/>
-              <w:b w:val="0"/>
-              <w:bCs w:val="0"/>
               <w:noProof/>
               <w:sz w:val="24"/>
               <w:szCs w:val="24"/>
               <w:lang w:eastAsia="en-GB"/>
             </w:rPr>
           </w:pPr>
-          <w:hyperlink w:anchor="_Toc226212772" w:history="1">
+          <w:hyperlink w:anchor="_Toc226965390" w:history="1">
             <w:r>
               <w:rPr>
                 <w:rStyle w:val="Hyperlink"/>
                 <w:noProof/>
               </w:rPr>
-              <w:t>Return Calculation</w:t>
+              <w:t>Figure 15. Graph of inertia values for k-means models from 1-10 cluster values.</w:t>
             </w:r>
             <w:r>
               <w:rPr>
@@ -1210,7 +2439,7 @@
                 <w:noProof/>
                 <w:webHidden/>
               </w:rPr>
-              <w:instrText xml:space="preserve"> PAGEREF _Toc226212772 \h </w:instrText>
+              <w:instrText xml:space="preserve"> PAGEREF _Toc226965390 \h </w:instrText>
             </w:r>
             <w:r>
               <w:rPr>
@@ -1230,7 +2459,7 @@
                 <w:noProof/>
                 <w:webHidden/>
               </w:rPr>
-              <w:t>7</w:t>
+              <w:t>20</w:t>
             </w:r>
             <w:r>
               <w:rPr>
@@ -1243,27 +2472,25 @@
         </w:p>
         <w:p>
           <w:pPr>
-            <w:pStyle w:val="TOC2"/>
+            <w:pStyle w:val="TOC3"/>
             <w:tabs>
               <w:tab w:val="right" w:leader="dot" w:pos="9016"/>
             </w:tabs>
             <w:rPr>
               <w:rFonts w:eastAsiaTheme="minorEastAsia"/>
-              <w:b w:val="0"/>
-              <w:bCs w:val="0"/>
               <w:noProof/>
               <w:sz w:val="24"/>
               <w:szCs w:val="24"/>
               <w:lang w:eastAsia="en-GB"/>
             </w:rPr>
           </w:pPr>
-          <w:hyperlink w:anchor="_Toc226212773" w:history="1">
+          <w:hyperlink w:anchor="_Toc226965391" w:history="1">
             <w:r>
               <w:rPr>
                 <w:rStyle w:val="Hyperlink"/>
                 <w:noProof/>
               </w:rPr>
-              <w:t>Beta Calculation</w:t>
+              <w:t>Figure 16. K=4 cluster segmentation plot.</w:t>
             </w:r>
             <w:r>
               <w:rPr>
@@ -1284,7 +2511,7 @@
                 <w:noProof/>
                 <w:webHidden/>
               </w:rPr>
-              <w:instrText xml:space="preserve"> PAGEREF _Toc226212773 \h </w:instrText>
+              <w:instrText xml:space="preserve"> PAGEREF _Toc226965391 \h </w:instrText>
             </w:r>
             <w:r>
               <w:rPr>
@@ -1304,7 +2531,7 @@
                 <w:noProof/>
                 <w:webHidden/>
               </w:rPr>
-              <w:t>7</w:t>
+              <w:t>20</w:t>
             </w:r>
             <w:r>
               <w:rPr>
@@ -1317,27 +2544,25 @@
         </w:p>
         <w:p>
           <w:pPr>
-            <w:pStyle w:val="TOC2"/>
+            <w:pStyle w:val="TOC3"/>
             <w:tabs>
               <w:tab w:val="right" w:leader="dot" w:pos="9016"/>
             </w:tabs>
             <w:rPr>
               <w:rFonts w:eastAsiaTheme="minorEastAsia"/>
-              <w:b w:val="0"/>
-              <w:bCs w:val="0"/>
               <w:noProof/>
               <w:sz w:val="24"/>
               <w:szCs w:val="24"/>
               <w:lang w:eastAsia="en-GB"/>
             </w:rPr>
           </w:pPr>
-          <w:hyperlink w:anchor="_Toc226212774" w:history="1">
+          <w:hyperlink w:anchor="_Toc226965392" w:history="1">
             <w:r>
               <w:rPr>
                 <w:rStyle w:val="Hyperlink"/>
                 <w:noProof/>
               </w:rPr>
-              <w:t>Volatility Calculation</w:t>
+              <w:t>Figure 17. K=4 cluster segmentation plot.</w:t>
             </w:r>
             <w:r>
               <w:rPr>
@@ -1358,7 +2583,7 @@
                 <w:noProof/>
                 <w:webHidden/>
               </w:rPr>
-              <w:instrText xml:space="preserve"> PAGEREF _Toc226212774 \h </w:instrText>
+              <w:instrText xml:space="preserve"> PAGEREF _Toc226965392 \h </w:instrText>
             </w:r>
             <w:r>
               <w:rPr>
@@ -1378,155 +2603,7 @@
                 <w:noProof/>
                 <w:webHidden/>
               </w:rPr>
-              <w:t>7</w:t>
-            </w:r>
-            <w:r>
-              <w:rPr>
-                <w:noProof/>
-                <w:webHidden/>
-              </w:rPr>
-              <w:fldChar w:fldCharType="end"/>
-            </w:r>
-          </w:hyperlink>
-        </w:p>
-        <w:p>
-          <w:pPr>
-            <w:pStyle w:val="TOC2"/>
-            <w:tabs>
-              <w:tab w:val="right" w:leader="dot" w:pos="9016"/>
-            </w:tabs>
-            <w:rPr>
-              <w:rFonts w:eastAsiaTheme="minorEastAsia"/>
-              <w:b w:val="0"/>
-              <w:bCs w:val="0"/>
-              <w:noProof/>
-              <w:sz w:val="24"/>
-              <w:szCs w:val="24"/>
-              <w:lang w:eastAsia="en-GB"/>
-            </w:rPr>
-          </w:pPr>
-          <w:hyperlink w:anchor="_Toc226212775" w:history="1">
-            <w:r>
-              <w:rPr>
-                <w:rStyle w:val="Hyperlink"/>
-                <w:noProof/>
-              </w:rPr>
-              <w:t>Summary Metrics</w:t>
-            </w:r>
-            <w:r>
-              <w:rPr>
-                <w:noProof/>
-                <w:webHidden/>
-              </w:rPr>
-              <w:tab/>
-            </w:r>
-            <w:r>
-              <w:rPr>
-                <w:noProof/>
-                <w:webHidden/>
-              </w:rPr>
-              <w:fldChar w:fldCharType="begin"/>
-            </w:r>
-            <w:r>
-              <w:rPr>
-                <w:noProof/>
-                <w:webHidden/>
-              </w:rPr>
-              <w:instrText xml:space="preserve"> PAGEREF _Toc226212775 \h </w:instrText>
-            </w:r>
-            <w:r>
-              <w:rPr>
-                <w:noProof/>
-                <w:webHidden/>
-              </w:rPr>
-            </w:r>
-            <w:r>
-              <w:rPr>
-                <w:noProof/>
-                <w:webHidden/>
-              </w:rPr>
-              <w:fldChar w:fldCharType="separate"/>
-            </w:r>
-            <w:r>
-              <w:rPr>
-                <w:noProof/>
-                <w:webHidden/>
-              </w:rPr>
-              <w:t>7</w:t>
-            </w:r>
-            <w:r>
-              <w:rPr>
-                <w:noProof/>
-                <w:webHidden/>
-              </w:rPr>
-              <w:fldChar w:fldCharType="end"/>
-            </w:r>
-          </w:hyperlink>
-        </w:p>
-        <w:p>
-          <w:pPr>
-            <w:pStyle w:val="TOC2"/>
-            <w:tabs>
-              <w:tab w:val="right" w:leader="dot" w:pos="9016"/>
-            </w:tabs>
-            <w:rPr>
-              <w:rFonts w:eastAsiaTheme="minorEastAsia"/>
-              <w:b w:val="0"/>
-              <w:bCs w:val="0"/>
-              <w:noProof/>
-              <w:sz w:val="24"/>
-              <w:szCs w:val="24"/>
-              <w:lang w:eastAsia="en-GB"/>
-            </w:rPr>
-          </w:pPr>
-          <w:hyperlink w:anchor="_Toc226212776" w:history="1">
-            <w:r>
-              <w:rPr>
-                <w:rStyle w:val="Hyperlink"/>
-                <w:noProof/>
-              </w:rPr>
-              <w:t>Visual Analysis</w:t>
-            </w:r>
-            <w:r>
-              <w:rPr>
-                <w:noProof/>
-                <w:webHidden/>
-              </w:rPr>
-              <w:tab/>
-            </w:r>
-            <w:r>
-              <w:rPr>
-                <w:noProof/>
-                <w:webHidden/>
-              </w:rPr>
-              <w:fldChar w:fldCharType="begin"/>
-            </w:r>
-            <w:r>
-              <w:rPr>
-                <w:noProof/>
-                <w:webHidden/>
-              </w:rPr>
-              <w:instrText xml:space="preserve"> PAGEREF _Toc226212776 \h </w:instrText>
-            </w:r>
-            <w:r>
-              <w:rPr>
-                <w:noProof/>
-                <w:webHidden/>
-              </w:rPr>
-            </w:r>
-            <w:r>
-              <w:rPr>
-                <w:noProof/>
-                <w:webHidden/>
-              </w:rPr>
-              <w:fldChar w:fldCharType="separate"/>
-            </w:r>
-            <w:r>
-              <w:rPr>
-                <w:noProof/>
-                <w:webHidden/>
-              </w:rPr>
-              <w:t>7</w:t>
+              <w:t>21</w:t>
             </w:r>
             <w:r>
               <w:rPr>
@@ -1607,28 +2684,78 @@
           <w:rFonts w:asciiTheme="minorHAnsi" w:hAnsiTheme="minorHAnsi"/>
         </w:rPr>
       </w:pPr>
-      <w:bookmarkStart w:id="0" w:name="_Toc226212758"/>
-      <w:r>
+    </w:p>
+    <w:p>
+      <w:pPr>
+        <w:pStyle w:val="Heading1"/>
         <w:rPr>
           <w:rFonts w:asciiTheme="minorHAnsi" w:hAnsiTheme="minorHAnsi"/>
         </w:rPr>
+      </w:pPr>
+    </w:p>
+    <w:p>
+      <w:pPr>
+        <w:pStyle w:val="Heading1"/>
+        <w:rPr>
+          <w:rFonts w:asciiTheme="minorHAnsi" w:hAnsiTheme="minorHAnsi"/>
+        </w:rPr>
+      </w:pPr>
+    </w:p>
+    <w:p>
+      <w:pPr>
+        <w:pStyle w:val="Heading1"/>
+        <w:rPr>
+          <w:rFonts w:asciiTheme="minorHAnsi" w:hAnsiTheme="minorHAnsi"/>
+        </w:rPr>
+      </w:pPr>
+    </w:p>
+    <w:p>
+      <w:pPr>
+        <w:pStyle w:val="Heading1"/>
+        <w:rPr>
+          <w:rFonts w:asciiTheme="minorHAnsi" w:hAnsiTheme="minorHAnsi"/>
+        </w:rPr>
+      </w:pPr>
+    </w:p>
+    <w:p/>
+    <w:p/>
+    <w:p>
+      <w:pPr>
+        <w:pStyle w:val="Heading1"/>
+        <w:rPr>
+          <w:rFonts w:asciiTheme="minorHAnsi" w:hAnsiTheme="minorHAnsi"/>
+        </w:rPr>
+      </w:pPr>
+    </w:p>
+    <w:p>
+      <w:pPr>
+        <w:pStyle w:val="Heading1"/>
+        <w:rPr>
+          <w:rFonts w:asciiTheme="minorHAnsi" w:hAnsiTheme="minorHAnsi"/>
+        </w:rPr>
+      </w:pPr>
+      <w:bookmarkStart w:id="0" w:name="_Toc226965359"/>
+      <w:r>
+        <w:rPr>
+          <w:rFonts w:asciiTheme="minorHAnsi" w:hAnsiTheme="minorHAnsi"/>
+        </w:rPr>
         <w:t>Task A</w:t>
       </w:r>
       <w:bookmarkEnd w:id="0"/>
     </w:p>
     <w:p>
       <w:pPr>
-        <w:pStyle w:val="Heading2"/>
-        <w:rPr>
-          <w:rFonts w:asciiTheme="minorHAnsi" w:hAnsiTheme="minorHAnsi"/>
-        </w:rPr>
-      </w:pPr>
-      <w:bookmarkStart w:id="1" w:name="_Toc226212759"/>
-      <w:r>
-        <w:rPr>
-          <w:rFonts w:asciiTheme="minorHAnsi" w:hAnsiTheme="minorHAnsi"/>
-        </w:rPr>
-        <w:t>Figure 1-Tickers List</w:t>
+        <w:pStyle w:val="Heading3"/>
+      </w:pPr>
+      <w:bookmarkStart w:id="1" w:name="_Toc226965360"/>
+      <w:r>
+        <w:t>Figure 1</w:t>
+      </w:r>
+      <w:r>
+        <w:t xml:space="preserve">. </w:t>
+      </w:r>
+      <w:r>
+        <w:t>Tickers List</w:t>
       </w:r>
       <w:bookmarkEnd w:id="1"/>
     </w:p>
@@ -1699,17 +2826,17 @@
     </w:p>
     <w:p>
       <w:pPr>
-        <w:pStyle w:val="Heading2"/>
-        <w:rPr>
-          <w:rFonts w:asciiTheme="minorHAnsi" w:hAnsiTheme="minorHAnsi"/>
-        </w:rPr>
-      </w:pPr>
-      <w:bookmarkStart w:id="2" w:name="_Toc226212760"/>
-      <w:r>
-        <w:rPr>
-          <w:rFonts w:asciiTheme="minorHAnsi" w:hAnsiTheme="minorHAnsi"/>
-        </w:rPr>
-        <w:t>Figure 2-Dataset Shape</w:t>
+        <w:pStyle w:val="Heading3"/>
+      </w:pPr>
+      <w:bookmarkStart w:id="2" w:name="_Toc226965361"/>
+      <w:r>
+        <w:t>Figure 2</w:t>
+      </w:r>
+      <w:r>
+        <w:t xml:space="preserve">. </w:t>
+      </w:r>
+      <w:r>
+        <w:t>Dataset Shape</w:t>
       </w:r>
       <w:bookmarkEnd w:id="2"/>
     </w:p>
@@ -1775,40 +2902,23 @@
           <w:sz w:val="27"/>
           <w:szCs w:val="27"/>
         </w:rPr>
-        <w:t xml:space="preserve">This confirms that price data was successfully downloaded for all tickers over the selected </w:t>
-      </w:r>
-      <w:proofErr w:type="gramStart"/>
-      <w:r>
-        <w:rPr>
-          <w:color w:val="000000"/>
-          <w:sz w:val="27"/>
-          <w:szCs w:val="27"/>
-        </w:rPr>
-        <w:t>time period</w:t>
-      </w:r>
-      <w:proofErr w:type="gramEnd"/>
-      <w:r>
-        <w:rPr>
-          <w:color w:val="000000"/>
-          <w:sz w:val="27"/>
-          <w:szCs w:val="27"/>
-        </w:rPr>
-        <w:t>.</w:t>
-      </w:r>
-    </w:p>
-    <w:p>
-      <w:pPr>
-        <w:pStyle w:val="Heading2"/>
-        <w:rPr>
-          <w:rFonts w:asciiTheme="minorHAnsi" w:hAnsiTheme="minorHAnsi"/>
-        </w:rPr>
-      </w:pPr>
-      <w:bookmarkStart w:id="3" w:name="_Toc226212761"/>
-      <w:r>
-        <w:rPr>
-          <w:rFonts w:asciiTheme="minorHAnsi" w:hAnsiTheme="minorHAnsi"/>
-        </w:rPr>
-        <w:t>Figure 3-Cleaning (Before &amp; After)</w:t>
+        <w:t>This confirms that price data was successfully downloaded for all tickers over the selected time period.</w:t>
+      </w:r>
+    </w:p>
+    <w:p>
+      <w:pPr>
+        <w:pStyle w:val="Heading3"/>
+      </w:pPr>
+      <w:bookmarkStart w:id="3" w:name="_Toc226965362"/>
+      <w:r>
+        <w:lastRenderedPageBreak/>
+        <w:t>Figure 3</w:t>
+      </w:r>
+      <w:r>
+        <w:t xml:space="preserve">. </w:t>
+      </w:r>
+      <w:r>
+        <w:t>Cleaning (Before &amp; After)</w:t>
       </w:r>
       <w:bookmarkEnd w:id="3"/>
     </w:p>
@@ -1888,18 +2998,17 @@
     </w:p>
     <w:p>
       <w:pPr>
-        <w:pStyle w:val="Heading2"/>
-        <w:rPr>
-          <w:rFonts w:asciiTheme="minorHAnsi" w:hAnsiTheme="minorHAnsi"/>
-        </w:rPr>
-      </w:pPr>
-      <w:bookmarkStart w:id="4" w:name="_Toc226212762"/>
-      <w:r>
-        <w:rPr>
-          <w:rFonts w:asciiTheme="minorHAnsi" w:hAnsiTheme="minorHAnsi"/>
-        </w:rPr>
-        <w:lastRenderedPageBreak/>
-        <w:t>Figure 4-Daily Returns</w:t>
+        <w:pStyle w:val="Heading3"/>
+      </w:pPr>
+      <w:bookmarkStart w:id="4" w:name="_Toc226965363"/>
+      <w:r>
+        <w:t>Figure 4</w:t>
+      </w:r>
+      <w:r>
+        <w:t xml:space="preserve">. </w:t>
+      </w:r>
+      <w:r>
+        <w:t>Daily Returns</w:t>
       </w:r>
       <w:bookmarkEnd w:id="4"/>
     </w:p>
@@ -1970,17 +3079,18 @@
     </w:p>
     <w:p>
       <w:pPr>
-        <w:pStyle w:val="Heading2"/>
-        <w:rPr>
-          <w:rFonts w:asciiTheme="minorHAnsi" w:hAnsiTheme="minorHAnsi"/>
-        </w:rPr>
-      </w:pPr>
-      <w:bookmarkStart w:id="5" w:name="_Toc226212763"/>
-      <w:r>
-        <w:rPr>
-          <w:rFonts w:asciiTheme="minorHAnsi" w:hAnsiTheme="minorHAnsi"/>
-        </w:rPr>
-        <w:t>Figure 5-Beta Table</w:t>
+        <w:pStyle w:val="Heading3"/>
+      </w:pPr>
+      <w:bookmarkStart w:id="5" w:name="_Toc226965364"/>
+      <w:r>
+        <w:lastRenderedPageBreak/>
+        <w:t>Figure 5</w:t>
+      </w:r>
+      <w:r>
+        <w:t xml:space="preserve">. </w:t>
+      </w:r>
+      <w:r>
+        <w:t>Beta Table</w:t>
       </w:r>
       <w:bookmarkEnd w:id="5"/>
     </w:p>
@@ -2051,18 +3161,18 @@
     </w:p>
     <w:p>
       <w:pPr>
-        <w:pStyle w:val="Heading2"/>
-        <w:rPr>
-          <w:rFonts w:asciiTheme="minorHAnsi" w:hAnsiTheme="minorHAnsi"/>
-        </w:rPr>
-      </w:pPr>
-      <w:bookmarkStart w:id="6" w:name="_Toc226212764"/>
-      <w:r>
-        <w:rPr>
-          <w:rFonts w:asciiTheme="minorHAnsi" w:hAnsiTheme="minorHAnsi"/>
-        </w:rPr>
+        <w:pStyle w:val="Heading3"/>
+      </w:pPr>
+      <w:bookmarkStart w:id="6" w:name="_Toc226965365"/>
+      <w:r>
         <w:lastRenderedPageBreak/>
-        <w:t>Figure 6-Volatility Table</w:t>
+        <w:t>Figure 6</w:t>
+      </w:r>
+      <w:r>
+        <w:t xml:space="preserve">. </w:t>
+      </w:r>
+      <w:r>
+        <w:t>Volatility Table</w:t>
       </w:r>
       <w:bookmarkEnd w:id="6"/>
     </w:p>
@@ -2126,17 +3236,17 @@
     </w:p>
     <w:p>
       <w:pPr>
-        <w:pStyle w:val="Heading2"/>
-        <w:rPr>
-          <w:rFonts w:asciiTheme="minorHAnsi" w:hAnsiTheme="minorHAnsi"/>
-        </w:rPr>
-      </w:pPr>
-      <w:bookmarkStart w:id="7" w:name="_Toc226212765"/>
-      <w:r>
-        <w:rPr>
-          <w:rFonts w:asciiTheme="minorHAnsi" w:hAnsiTheme="minorHAnsi"/>
-        </w:rPr>
-        <w:t>Figure 7-Average Daily Returns Table</w:t>
+        <w:pStyle w:val="Heading3"/>
+      </w:pPr>
+      <w:bookmarkStart w:id="7" w:name="_Toc226965366"/>
+      <w:r>
+        <w:t>Figure 7</w:t>
+      </w:r>
+      <w:r>
+        <w:t xml:space="preserve">. </w:t>
+      </w:r>
+      <w:r>
+        <w:t>Average Daily Returns Table</w:t>
       </w:r>
       <w:bookmarkEnd w:id="7"/>
     </w:p>
@@ -2194,7 +3304,6 @@
           </wp:inline>
         </w:drawing>
       </w:r>
-      <w:bookmarkStart w:id="8" w:name="_Toc226212766"/>
     </w:p>
     <w:p>
       <w:r>
@@ -2203,22 +3312,23 @@
           <w:sz w:val="27"/>
           <w:szCs w:val="27"/>
         </w:rPr>
+        <w:lastRenderedPageBreak/>
         <w:t>This shows the average return generated by each stock, providing a measure of overall performance.</w:t>
       </w:r>
     </w:p>
     <w:p>
       <w:pPr>
-        <w:pStyle w:val="Heading2"/>
-        <w:rPr>
-          <w:rFonts w:asciiTheme="minorHAnsi" w:hAnsiTheme="minorHAnsi"/>
-        </w:rPr>
-      </w:pPr>
-      <w:r>
-        <w:rPr>
-          <w:rFonts w:asciiTheme="minorHAnsi" w:hAnsiTheme="minorHAnsi"/>
-        </w:rPr>
-        <w:lastRenderedPageBreak/>
-        <w:t>Figure 8-Summary Table</w:t>
+        <w:pStyle w:val="Heading3"/>
+      </w:pPr>
+      <w:bookmarkStart w:id="8" w:name="_Toc226965367"/>
+      <w:r>
+        <w:t>Figure 8</w:t>
+      </w:r>
+      <w:r>
+        <w:t xml:space="preserve">. </w:t>
+      </w:r>
+      <w:r>
+        <w:t>Summary Table</w:t>
       </w:r>
       <w:bookmarkEnd w:id="8"/>
     </w:p>
@@ -2290,17 +3400,18 @@
     </w:p>
     <w:p>
       <w:pPr>
-        <w:pStyle w:val="Heading2"/>
-        <w:rPr>
-          <w:rFonts w:asciiTheme="minorHAnsi" w:hAnsiTheme="minorHAnsi"/>
-        </w:rPr>
-      </w:pPr>
-      <w:bookmarkStart w:id="9" w:name="_Toc226212767"/>
-      <w:r>
-        <w:rPr>
-          <w:rFonts w:asciiTheme="minorHAnsi" w:hAnsiTheme="minorHAnsi"/>
-        </w:rPr>
-        <w:t>Figure 9-Graph 1 (Beta Vs Return)</w:t>
+        <w:pStyle w:val="Heading3"/>
+      </w:pPr>
+      <w:bookmarkStart w:id="9" w:name="_Toc226965368"/>
+      <w:r>
+        <w:lastRenderedPageBreak/>
+        <w:t>Figure 9</w:t>
+      </w:r>
+      <w:r>
+        <w:t xml:space="preserve">. </w:t>
+      </w:r>
+      <w:r>
+        <w:t>Graph 1 (Beta Vs Return)</w:t>
       </w:r>
       <w:bookmarkEnd w:id="9"/>
     </w:p>
@@ -2359,7 +3470,6 @@
           </wp:inline>
         </w:drawing>
       </w:r>
-      <w:bookmarkStart w:id="10" w:name="_Toc226212768"/>
       <w:r>
         <w:rPr>
           <w:rFonts w:ascii="-webkit-standard" w:hAnsi="-webkit-standard"/>
@@ -2392,11 +3502,18 @@
     </w:p>
     <w:p>
       <w:pPr>
-        <w:pStyle w:val="Heading2"/>
-      </w:pPr>
+        <w:pStyle w:val="Heading3"/>
+      </w:pPr>
+      <w:bookmarkStart w:id="10" w:name="_Toc226965369"/>
       <w:r>
         <w:lastRenderedPageBreak/>
-        <w:t>Figure 10-Graph 2 (Volatility Distribution)</w:t>
+        <w:t>Figure 10</w:t>
+      </w:r>
+      <w:r>
+        <w:t xml:space="preserve">. </w:t>
+      </w:r>
+      <w:r>
+        <w:t>Graph 2 (Volatility Distribution)</w:t>
       </w:r>
       <w:bookmarkEnd w:id="10"/>
     </w:p>
@@ -2449,49 +3566,36 @@
       </w:r>
     </w:p>
     <w:p>
+      <w:bookmarkStart w:id="11" w:name="_Toc226963434"/>
+      <w:r>
+        <w:t>This histogram shows the distribution of stock volatility, highlighting how risk levels vary across the S&amp;P 500.</w:t>
+      </w:r>
+      <w:bookmarkEnd w:id="11"/>
+    </w:p>
+    <w:p>
       <w:pPr>
         <w:pStyle w:val="Heading1"/>
         <w:rPr>
           <w:rFonts w:asciiTheme="minorHAnsi" w:hAnsiTheme="minorHAnsi"/>
-          <w:color w:val="000000"/>
-          <w:sz w:val="27"/>
-          <w:szCs w:val="27"/>
-        </w:rPr>
-      </w:pPr>
-      <w:bookmarkStart w:id="11" w:name="_Toc226212769"/>
+        </w:rPr>
+      </w:pPr>
+      <w:bookmarkStart w:id="12" w:name="_Toc226965370"/>
       <w:r>
         <w:rPr>
           <w:rFonts w:asciiTheme="minorHAnsi" w:hAnsiTheme="minorHAnsi"/>
-          <w:color w:val="000000"/>
-          <w:sz w:val="27"/>
-          <w:szCs w:val="27"/>
-        </w:rPr>
-        <w:t>This histogram shows the distribution of stock volatility, highlighting how risk levels vary across the S&amp;P 500.</w:t>
-      </w:r>
-    </w:p>
-    <w:p>
-      <w:pPr>
-        <w:pStyle w:val="Heading1"/>
+        </w:rPr>
+        <w:t>Data Collection and Analysis</w:t>
+      </w:r>
+      <w:bookmarkEnd w:id="12"/>
+    </w:p>
+    <w:p>
+      <w:pPr>
+        <w:pStyle w:val="Heading2"/>
         <w:rPr>
           <w:rFonts w:asciiTheme="minorHAnsi" w:hAnsiTheme="minorHAnsi"/>
         </w:rPr>
       </w:pPr>
-      <w:r>
-        <w:rPr>
-          <w:rFonts w:asciiTheme="minorHAnsi" w:hAnsiTheme="minorHAnsi"/>
-        </w:rPr>
-        <w:t>Data Collection and Analysis</w:t>
-      </w:r>
-      <w:bookmarkEnd w:id="11"/>
-    </w:p>
-    <w:p>
-      <w:pPr>
-        <w:pStyle w:val="Heading2"/>
-        <w:rPr>
-          <w:rFonts w:asciiTheme="minorHAnsi" w:hAnsiTheme="minorHAnsi"/>
-        </w:rPr>
-      </w:pPr>
-      <w:bookmarkStart w:id="12" w:name="_Toc226212770"/>
+      <w:bookmarkStart w:id="13" w:name="_Toc226965371"/>
       <w:r>
         <w:rPr>
           <w:rStyle w:val="Strong"/>
@@ -2502,7 +3606,7 @@
         </w:rPr>
         <w:t>Data Collection</w:t>
       </w:r>
-      <w:bookmarkEnd w:id="12"/>
+      <w:bookmarkEnd w:id="13"/>
     </w:p>
     <w:p>
       <w:pPr>
@@ -2544,7 +3648,7 @@
           <w:rFonts w:asciiTheme="minorHAnsi" w:hAnsiTheme="minorHAnsi"/>
         </w:rPr>
       </w:pPr>
-      <w:bookmarkStart w:id="13" w:name="_Toc226212771"/>
+      <w:bookmarkStart w:id="14" w:name="_Toc226965372"/>
       <w:r>
         <w:rPr>
           <w:rStyle w:val="Strong"/>
@@ -2553,9 +3657,10 @@
           <w:bCs w:val="0"/>
           <w:color w:val="000000"/>
         </w:rPr>
+        <w:lastRenderedPageBreak/>
         <w:t>Data Cleaning</w:t>
       </w:r>
-      <w:bookmarkEnd w:id="13"/>
+      <w:bookmarkEnd w:id="14"/>
     </w:p>
     <w:p>
       <w:pPr>
@@ -2570,34 +3675,18 @@
           <w:rFonts w:asciiTheme="minorHAnsi" w:hAnsiTheme="minorHAnsi"/>
           <w:color w:val="000000"/>
         </w:rPr>
-        <w:t xml:space="preserve">The dataset initially contained missing values for some companies. To ensure consistency, any stocks with incomplete data were removed. This resulted in a clean dataset with fewer tickers but complete observations across the entire </w:t>
-      </w:r>
-      <w:proofErr w:type="gramStart"/>
-      <w:r>
+        <w:t>The dataset initially contained missing values for some companies. To ensure consistency, any stocks with incomplete data were removed. This resulted in a clean dataset with fewer tickers but complete observations across the entire time period.</w:t>
+      </w:r>
+    </w:p>
+    <w:p/>
+    <w:p>
+      <w:pPr>
+        <w:pStyle w:val="Heading2"/>
         <w:rPr>
           <w:rFonts w:asciiTheme="minorHAnsi" w:hAnsiTheme="minorHAnsi"/>
-          <w:color w:val="000000"/>
-        </w:rPr>
-        <w:t>time period</w:t>
-      </w:r>
-      <w:proofErr w:type="gramEnd"/>
-      <w:r>
-        <w:rPr>
-          <w:rFonts w:asciiTheme="minorHAnsi" w:hAnsiTheme="minorHAnsi"/>
-          <w:color w:val="000000"/>
-        </w:rPr>
-        <w:t>.</w:t>
-      </w:r>
-    </w:p>
-    <w:p/>
-    <w:p>
-      <w:pPr>
-        <w:pStyle w:val="Heading2"/>
-        <w:rPr>
-          <w:rFonts w:asciiTheme="minorHAnsi" w:hAnsiTheme="minorHAnsi"/>
-        </w:rPr>
-      </w:pPr>
-      <w:bookmarkStart w:id="14" w:name="_Toc226212772"/>
+        </w:rPr>
+      </w:pPr>
+      <w:bookmarkStart w:id="15" w:name="_Toc226965373"/>
       <w:r>
         <w:rPr>
           <w:rStyle w:val="Strong"/>
@@ -2608,7 +3697,7 @@
         </w:rPr>
         <w:t>Return Calculation</w:t>
       </w:r>
-      <w:bookmarkEnd w:id="14"/>
+      <w:bookmarkEnd w:id="15"/>
     </w:p>
     <w:p>
       <w:pPr>
@@ -2634,7 +3723,7 @@
           <w:rFonts w:asciiTheme="minorHAnsi" w:hAnsiTheme="minorHAnsi"/>
         </w:rPr>
       </w:pPr>
-      <w:bookmarkStart w:id="15" w:name="_Toc226212773"/>
+      <w:bookmarkStart w:id="16" w:name="_Toc226965374"/>
       <w:r>
         <w:rPr>
           <w:rStyle w:val="Strong"/>
@@ -2645,7 +3734,7 @@
         </w:rPr>
         <w:t>Beta Calculation</w:t>
       </w:r>
-      <w:bookmarkEnd w:id="15"/>
+      <w:bookmarkEnd w:id="16"/>
     </w:p>
     <w:p>
       <w:pPr>
@@ -2671,7 +3760,7 @@
           <w:rFonts w:asciiTheme="minorHAnsi" w:hAnsiTheme="minorHAnsi"/>
         </w:rPr>
       </w:pPr>
-      <w:bookmarkStart w:id="16" w:name="_Toc226212774"/>
+      <w:bookmarkStart w:id="17" w:name="_Toc226965375"/>
       <w:r>
         <w:rPr>
           <w:rStyle w:val="Strong"/>
@@ -2682,7 +3771,7 @@
         </w:rPr>
         <w:t>Volatility Calculation</w:t>
       </w:r>
-      <w:bookmarkEnd w:id="16"/>
+      <w:bookmarkEnd w:id="17"/>
     </w:p>
     <w:p>
       <w:pPr>
@@ -2708,7 +3797,7 @@
           <w:rFonts w:asciiTheme="minorHAnsi" w:hAnsiTheme="minorHAnsi"/>
         </w:rPr>
       </w:pPr>
-      <w:bookmarkStart w:id="17" w:name="_Toc226212775"/>
+      <w:bookmarkStart w:id="18" w:name="_Toc226965376"/>
       <w:r>
         <w:rPr>
           <w:rStyle w:val="Strong"/>
@@ -2719,7 +3808,7 @@
         </w:rPr>
         <w:t>Summary Metrics</w:t>
       </w:r>
-      <w:bookmarkEnd w:id="17"/>
+      <w:bookmarkEnd w:id="18"/>
     </w:p>
     <w:p>
       <w:pPr>
@@ -2745,7 +3834,7 @@
           <w:rFonts w:asciiTheme="minorHAnsi" w:hAnsiTheme="minorHAnsi"/>
         </w:rPr>
       </w:pPr>
-      <w:bookmarkStart w:id="18" w:name="_Toc226212776"/>
+      <w:bookmarkStart w:id="19" w:name="_Toc226965377"/>
       <w:r>
         <w:rPr>
           <w:rStyle w:val="Strong"/>
@@ -2756,7 +3845,7 @@
         </w:rPr>
         <w:t>Visual Analysis</w:t>
       </w:r>
-      <w:bookmarkEnd w:id="18"/>
+      <w:bookmarkEnd w:id="19"/>
     </w:p>
     <w:p>
       <w:pPr>
@@ -2827,9 +3916,1243 @@
       </w:r>
     </w:p>
     <w:p/>
+    <w:p>
+      <w:pPr>
+        <w:pStyle w:val="Heading1"/>
+        <w:rPr>
+          <w:rFonts w:asciiTheme="minorHAnsi" w:hAnsiTheme="minorHAnsi"/>
+        </w:rPr>
+      </w:pPr>
+      <w:bookmarkStart w:id="20" w:name="_Toc226965378"/>
+      <w:r>
+        <w:rPr>
+          <w:rFonts w:asciiTheme="minorHAnsi" w:hAnsiTheme="minorHAnsi"/>
+        </w:rPr>
+        <w:t xml:space="preserve">Task </w:t>
+      </w:r>
+      <w:r>
+        <w:rPr>
+          <w:rFonts w:asciiTheme="minorHAnsi" w:hAnsiTheme="minorHAnsi"/>
+        </w:rPr>
+        <w:t>B</w:t>
+      </w:r>
+      <w:bookmarkEnd w:id="20"/>
+    </w:p>
+    <w:p>
+      <w:pPr>
+        <w:pStyle w:val="Heading1"/>
+        <w:rPr>
+          <w:rFonts w:asciiTheme="minorHAnsi" w:hAnsiTheme="minorHAnsi"/>
+        </w:rPr>
+      </w:pPr>
+      <w:bookmarkStart w:id="21" w:name="_Toc226965379"/>
+      <w:r>
+        <w:rPr>
+          <w:rFonts w:asciiTheme="minorHAnsi" w:hAnsiTheme="minorHAnsi"/>
+        </w:rPr>
+        <w:t>Agglomerative Clustering</w:t>
+      </w:r>
+      <w:bookmarkEnd w:id="21"/>
+    </w:p>
+    <w:p>
+      <w:pPr>
+        <w:pStyle w:val="Heading2"/>
+        <w:rPr>
+          <w:rStyle w:val="Strong"/>
+          <w:b w:val="0"/>
+          <w:bCs w:val="0"/>
+        </w:rPr>
+      </w:pPr>
+      <w:bookmarkStart w:id="22" w:name="_Toc226965380"/>
+      <w:r>
+        <w:rPr>
+          <w:rStyle w:val="Strong"/>
+          <w:b w:val="0"/>
+          <w:bCs w:val="0"/>
+        </w:rPr>
+        <w:t>Appropriateness of Agglomerative clustering</w:t>
+      </w:r>
+      <w:bookmarkEnd w:id="22"/>
+    </w:p>
+    <w:p>
+      <w:r>
+        <w:t xml:space="preserve">Agglomerative clustering </w:t>
+      </w:r>
+      <w:r>
+        <w:t xml:space="preserve">is an appropriate clustering technique for this analysis as it is well suited to </w:t>
+      </w:r>
+      <w:r>
+        <w:t xml:space="preserve">exploratory financial segmentation where it is not clear to the natural structure of the data. </w:t>
+      </w:r>
+      <w:r>
+        <w:t xml:space="preserve">Agglomerative clustering builds clusters hierarchically </w:t>
+      </w:r>
+      <w:r>
+        <w:t xml:space="preserve">by progressively merging similar observations. This makes it </w:t>
+      </w:r>
+      <w:r>
+        <w:t xml:space="preserve">an effective modelling technique to identify the nested relationships between stocks and their </w:t>
+      </w:r>
+      <w:r>
+        <w:t xml:space="preserve">varying risk profiles. </w:t>
+      </w:r>
+    </w:p>
+    <w:p>
+      <w:r>
+        <w:t xml:space="preserve">For the clustering process, the summary </w:t>
+      </w:r>
+      <w:r>
+        <w:t xml:space="preserve">features engineered during the previous task </w:t>
+      </w:r>
+      <w:r>
+        <w:t>would be the features used for</w:t>
+      </w:r>
+      <w:r>
+        <w:t xml:space="preserve"> modelling the clust</w:t>
+      </w:r>
+      <w:r>
+        <w:t xml:space="preserve">ers. Average daily return, annual </w:t>
+      </w:r>
+      <w:r>
+        <w:lastRenderedPageBreak/>
+        <w:t xml:space="preserve">volatility and beta </w:t>
+      </w:r>
+      <w:r>
+        <w:t xml:space="preserve">are all continuous variables that observe gradual transitions </w:t>
+      </w:r>
+      <w:r>
+        <w:t>in stocks rather than sharply separated groups.</w:t>
+      </w:r>
+      <w:r>
+        <w:t xml:space="preserve"> This makes agglomerative clustering particularly suitable in this context as it does not assume spherical cluster shapes and can reveal meaningful and insightful</w:t>
+      </w:r>
+      <w:r>
+        <w:t xml:space="preserve"> hierarchal groupings among the stocks with similar mar</w:t>
+      </w:r>
+      <w:r>
+        <w:t>ket behaviour. Furthermore, th</w:t>
+      </w:r>
+      <w:r>
+        <w:t xml:space="preserve">e interpretability of agglomerative clustering </w:t>
+      </w:r>
+      <w:r>
+        <w:t xml:space="preserve">makes it effective at </w:t>
+      </w:r>
+      <w:r>
+        <w:t>produc</w:t>
+      </w:r>
+      <w:r>
+        <w:t>ing</w:t>
+      </w:r>
+      <w:r>
+        <w:t xml:space="preserve"> actionable portfolio grouping</w:t>
+      </w:r>
+      <w:r>
+        <w:t xml:space="preserve">. </w:t>
+      </w:r>
+    </w:p>
+    <w:p>
+      <w:r>
+        <w:t xml:space="preserve">However, a potential limitation of this </w:t>
+      </w:r>
+      <w:r>
+        <w:t>method is the computational power necessary can become expensive</w:t>
+      </w:r>
+      <w:r>
+        <w:t xml:space="preserve"> and it can also be distorted by </w:t>
+      </w:r>
+      <w:r>
+        <w:t xml:space="preserve">extreme outliers. Despite this, its overall ability to uncover structured </w:t>
+      </w:r>
+      <w:r>
+        <w:t>stock relationships affirms it as a</w:t>
+      </w:r>
+      <w:r>
+        <w:t xml:space="preserve"> highly </w:t>
+      </w:r>
+      <w:r>
+        <w:t>appropriate method for th</w:t>
+      </w:r>
+      <w:r>
+        <w:t xml:space="preserve">is stock portfolio analysis. </w:t>
+      </w:r>
+    </w:p>
+    <w:p/>
+    <w:p>
+      <w:pPr>
+        <w:pStyle w:val="Heading2"/>
+        <w:rPr>
+          <w:rStyle w:val="Strong"/>
+          <w:b w:val="0"/>
+          <w:bCs w:val="0"/>
+        </w:rPr>
+      </w:pPr>
+      <w:bookmarkStart w:id="23" w:name="_Toc226965381"/>
+      <w:r>
+        <w:rPr>
+          <w:rStyle w:val="Strong"/>
+          <w:b w:val="0"/>
+          <w:bCs w:val="0"/>
+        </w:rPr>
+        <w:t xml:space="preserve">Agglomerative Clustering </w:t>
+      </w:r>
+      <w:r>
+        <w:rPr>
+          <w:rStyle w:val="Strong"/>
+          <w:b w:val="0"/>
+          <w:bCs w:val="0"/>
+        </w:rPr>
+        <w:t>Implementation</w:t>
+      </w:r>
+      <w:bookmarkEnd w:id="23"/>
+    </w:p>
+    <w:p>
+      <w:r>
+        <w:t>T</w:t>
+      </w:r>
+      <w:r>
+        <w:t xml:space="preserve">he optimal number of clusters was investigated using the silhouette method. </w:t>
+      </w:r>
+      <w:r>
+        <w:t xml:space="preserve">The silhouette score </w:t>
+      </w:r>
+      <w:r>
+        <w:t>was</w:t>
+      </w:r>
+      <w:r>
+        <w:t xml:space="preserve"> calculated and </w:t>
+      </w:r>
+      <w:r>
+        <w:t xml:space="preserve">put into a plot for 2-9 clusters. </w:t>
+      </w:r>
+    </w:p>
+    <w:p>
+      <w:r>
+        <w:rPr>
+          <w:noProof/>
+        </w:rPr>
+        <w:drawing>
+          <wp:inline distT="0" distB="0" distL="0" distR="0" wp14:anchorId="1C47E2AC" wp14:editId="78078A08">
+            <wp:extent cx="3657600" cy="2895600"/>
+            <wp:effectExtent l="0" t="0" r="0" b="0"/>
+            <wp:docPr id="110019010" name="Picture 3"/>
+            <wp:cNvGraphicFramePr>
+              <a:graphicFrameLocks xmlns:a="http://schemas.openxmlformats.org/drawingml/2006/main" noChangeAspect="1"/>
+            </wp:cNvGraphicFramePr>
+            <a:graphic xmlns:a="http://schemas.openxmlformats.org/drawingml/2006/main">
+              <a:graphicData uri="http://schemas.openxmlformats.org/drawingml/2006/picture">
+                <pic:pic xmlns:pic="http://schemas.openxmlformats.org/drawingml/2006/picture">
+                  <pic:nvPicPr>
+                    <pic:cNvPr id="0" name="Picture 5"/>
+                    <pic:cNvPicPr>
+                      <a:picLocks noChangeAspect="1" noChangeArrowheads="1"/>
+                    </pic:cNvPicPr>
+                  </pic:nvPicPr>
+                  <pic:blipFill>
+                    <a:blip r:embed="rId18">
+                      <a:extLst>
+                        <a:ext uri="{28A0092B-C50C-407E-A947-70E740481C1C}">
+                          <a14:useLocalDpi xmlns:a14="http://schemas.microsoft.com/office/drawing/2010/main" val="0"/>
+                        </a:ext>
+                      </a:extLst>
+                    </a:blip>
+                    <a:srcRect/>
+                    <a:stretch>
+                      <a:fillRect/>
+                    </a:stretch>
+                  </pic:blipFill>
+                  <pic:spPr bwMode="auto">
+                    <a:xfrm>
+                      <a:off x="0" y="0"/>
+                      <a:ext cx="3657600" cy="2895600"/>
+                    </a:xfrm>
+                    <a:prstGeom prst="rect">
+                      <a:avLst/>
+                    </a:prstGeom>
+                    <a:noFill/>
+                    <a:ln>
+                      <a:noFill/>
+                    </a:ln>
+                  </pic:spPr>
+                </pic:pic>
+              </a:graphicData>
+            </a:graphic>
+          </wp:inline>
+        </w:drawing>
+      </w:r>
+    </w:p>
+    <w:p>
+      <w:pPr>
+        <w:pStyle w:val="Heading3"/>
+      </w:pPr>
+      <w:bookmarkStart w:id="24" w:name="_Toc226965382"/>
+      <w:r>
+        <w:lastRenderedPageBreak/>
+        <w:t xml:space="preserve">Figure </w:t>
+      </w:r>
+      <w:r>
+        <w:t>1</w:t>
+      </w:r>
+      <w:r>
+        <w:t>1</w:t>
+      </w:r>
+      <w:r>
+        <w:t>.</w:t>
+      </w:r>
+      <w:r>
+        <w:t xml:space="preserve"> Silhouette plot for </w:t>
+      </w:r>
+      <w:r>
+        <w:t>2-9 clusters</w:t>
+      </w:r>
+      <w:bookmarkEnd w:id="24"/>
+    </w:p>
+    <w:p>
+      <w:r>
+        <w:t xml:space="preserve">3,4 and 5 clusters </w:t>
+      </w:r>
+      <w:r>
+        <w:t xml:space="preserve">were moved forward for further visual analysis as they </w:t>
+      </w:r>
+      <w:r>
+        <w:t xml:space="preserve">showed strong silhouette scores while also offering a richer and more informative segmentation structure. </w:t>
+      </w:r>
+    </w:p>
+    <w:p>
+      <w:r>
+        <w:t xml:space="preserve">In order to further investigate the cluster segmentation of these </w:t>
+      </w:r>
+      <w:r>
+        <w:t xml:space="preserve">clusters, each number of clusters was </w:t>
+      </w:r>
+      <w:r>
+        <w:t>put into an agglomerative clustering model</w:t>
+      </w:r>
+      <w:r>
+        <w:t xml:space="preserve">. A plot for each model was then made for visual analysis. </w:t>
+      </w:r>
+    </w:p>
+    <w:p>
+      <w:r>
+        <w:t>After visually comparing the three c</w:t>
+      </w:r>
+      <w:r>
+        <w:t>luster</w:t>
+      </w:r>
+      <w:r>
+        <w:t xml:space="preserve"> model</w:t>
+      </w:r>
+      <w:r>
+        <w:t xml:space="preserve"> solutions, the four-cluster model was selected as the most appropriate configuration because it provided the strongest balance between interpretability, granularity, and meaningful financial segmentation.</w:t>
+      </w:r>
+    </w:p>
+    <w:p/>
+    <w:p>
+      <w:r>
+        <w:rPr>
+          <w:noProof/>
+        </w:rPr>
+        <w:drawing>
+          <wp:inline distT="0" distB="0" distL="0" distR="0" wp14:anchorId="27490013" wp14:editId="43EB0205">
+            <wp:extent cx="3606800" cy="2895600"/>
+            <wp:effectExtent l="0" t="0" r="0" b="0"/>
+            <wp:docPr id="276821779" name="Picture 8"/>
+            <wp:cNvGraphicFramePr>
+              <a:graphicFrameLocks xmlns:a="http://schemas.openxmlformats.org/drawingml/2006/main" noChangeAspect="1"/>
+            </wp:cNvGraphicFramePr>
+            <a:graphic xmlns:a="http://schemas.openxmlformats.org/drawingml/2006/main">
+              <a:graphicData uri="http://schemas.openxmlformats.org/drawingml/2006/picture">
+                <pic:pic xmlns:pic="http://schemas.openxmlformats.org/drawingml/2006/picture">
+                  <pic:nvPicPr>
+                    <pic:cNvPr id="0" name="Picture 13"/>
+                    <pic:cNvPicPr>
+                      <a:picLocks noChangeAspect="1" noChangeArrowheads="1"/>
+                    </pic:cNvPicPr>
+                  </pic:nvPicPr>
+                  <pic:blipFill>
+                    <a:blip r:embed="rId19">
+                      <a:extLst>
+                        <a:ext uri="{28A0092B-C50C-407E-A947-70E740481C1C}">
+                          <a14:useLocalDpi xmlns:a14="http://schemas.microsoft.com/office/drawing/2010/main" val="0"/>
+                        </a:ext>
+                      </a:extLst>
+                    </a:blip>
+                    <a:srcRect/>
+                    <a:stretch>
+                      <a:fillRect/>
+                    </a:stretch>
+                  </pic:blipFill>
+                  <pic:spPr bwMode="auto">
+                    <a:xfrm>
+                      <a:off x="0" y="0"/>
+                      <a:ext cx="3606800" cy="2895600"/>
+                    </a:xfrm>
+                    <a:prstGeom prst="rect">
+                      <a:avLst/>
+                    </a:prstGeom>
+                    <a:noFill/>
+                    <a:ln>
+                      <a:noFill/>
+                    </a:ln>
+                  </pic:spPr>
+                </pic:pic>
+              </a:graphicData>
+            </a:graphic>
+          </wp:inline>
+        </w:drawing>
+      </w:r>
+    </w:p>
+    <w:p>
+      <w:pPr>
+        <w:pStyle w:val="Heading3"/>
+      </w:pPr>
+      <w:bookmarkStart w:id="25" w:name="_Toc226965383"/>
+      <w:r>
+        <w:t xml:space="preserve">Figure </w:t>
+      </w:r>
+      <w:r>
+        <w:t>1</w:t>
+      </w:r>
+      <w:r>
+        <w:t>2.</w:t>
+      </w:r>
+      <w:r>
+        <w:t xml:space="preserve"> Plot for </w:t>
+      </w:r>
+      <w:r>
+        <w:t>k=4 cluster segmentation.</w:t>
+      </w:r>
+      <w:bookmarkEnd w:id="25"/>
+      <w:r>
+        <w:t xml:space="preserve"> </w:t>
+      </w:r>
+    </w:p>
+    <w:p>
+      <w:r>
+        <w:t>While the three</w:t>
+      </w:r>
+      <w:r>
+        <w:t>-</w:t>
+      </w:r>
+      <w:r>
+        <w:t xml:space="preserve">cluster solution </w:t>
+      </w:r>
+      <w:r>
+        <w:t>presented clear separation among cluster groups, it grouped too many medium-risk stocks into broad middle categories</w:t>
+      </w:r>
+      <w:r>
+        <w:t xml:space="preserve">. This would limit </w:t>
+      </w:r>
+      <w:r>
+        <w:lastRenderedPageBreak/>
+        <w:t xml:space="preserve">the level insight that could be drawn from any analysis. </w:t>
+      </w:r>
+      <w:r>
+        <w:t xml:space="preserve">This would also mean that values with largely different beta and volatility value characteristics were merged in the same clusters, this therefore meant no distinction between lower-medium risk and higher-medium risk could be made. </w:t>
+      </w:r>
+    </w:p>
+    <w:p>
+      <w:r>
+        <w:t xml:space="preserve">The </w:t>
+      </w:r>
+      <w:r>
+        <w:t>four-cluster</w:t>
+      </w:r>
+      <w:r>
+        <w:t xml:space="preserve"> solution </w:t>
+      </w:r>
+      <w:r>
+        <w:t>would add an additional level of segmentation in this regard</w:t>
+      </w:r>
+      <w:r>
+        <w:t xml:space="preserve">, without overcomplicating the model. </w:t>
+      </w:r>
+      <w:r>
+        <w:t>This meant that clusters could be categorized into more meaningful and insightful subgroups</w:t>
+      </w:r>
+      <w:r>
+        <w:t xml:space="preserve">, especially distinguishing between </w:t>
+      </w:r>
+      <w:r>
+        <w:t>defensive low-risk stocks, stable core holdings, moderate growth stocks, and aggressive high-risk stocks.</w:t>
+      </w:r>
+      <w:r>
+        <w:t xml:space="preserve"> In terms of portfolio investment, this model </w:t>
+      </w:r>
+      <w:r>
+        <w:t>would be more aligned to reflecting different investment strategies.</w:t>
+      </w:r>
+      <w:r>
+        <w:t xml:space="preserve"> </w:t>
+      </w:r>
+    </w:p>
+    <w:p>
+      <w:r>
+        <w:t xml:space="preserve">While the five cluster model </w:t>
+      </w:r>
+      <w:r>
+        <w:t xml:space="preserve">would potentially offer greater detail in terms of sub-group, it was not chosen as the optimal model as it began to over-segment the lower risk region of the data, </w:t>
+      </w:r>
+      <w:r>
+        <w:t>Several clusters in the low-beta, low-volatility range became fragmented into groups that were visually close together and financially similar, making them harder to justify as genuinely distinct investment categories</w:t>
+      </w:r>
+      <w:r>
+        <w:t>. Therefore</w:t>
+      </w:r>
+      <w:r>
+        <w:t>,</w:t>
+      </w:r>
+      <w:r>
+        <w:t xml:space="preserve"> continuing with this model would risk </w:t>
+      </w:r>
+      <w:r>
+        <w:t xml:space="preserve">diluting the usefulness for portfolio analysis. </w:t>
+      </w:r>
+    </w:p>
+    <w:p>
+      <w:pPr>
+        <w:pStyle w:val="Heading1"/>
+        <w:rPr>
+          <w:rFonts w:asciiTheme="minorHAnsi" w:hAnsiTheme="minorHAnsi"/>
+        </w:rPr>
+      </w:pPr>
+      <w:bookmarkStart w:id="26" w:name="_Toc226965384"/>
+      <w:r>
+        <w:rPr>
+          <w:rFonts w:asciiTheme="minorHAnsi" w:hAnsiTheme="minorHAnsi"/>
+        </w:rPr>
+        <w:t>K-means</w:t>
+      </w:r>
+      <w:r>
+        <w:rPr>
+          <w:rFonts w:asciiTheme="minorHAnsi" w:hAnsiTheme="minorHAnsi"/>
+        </w:rPr>
+        <w:t xml:space="preserve"> Clustering</w:t>
+      </w:r>
+      <w:bookmarkEnd w:id="26"/>
+    </w:p>
+    <w:p>
+      <w:pPr>
+        <w:pStyle w:val="Heading2"/>
+        <w:rPr>
+          <w:rStyle w:val="Strong"/>
+          <w:b w:val="0"/>
+          <w:bCs w:val="0"/>
+        </w:rPr>
+      </w:pPr>
+      <w:bookmarkStart w:id="27" w:name="_Toc226965385"/>
+      <w:r>
+        <w:rPr>
+          <w:rStyle w:val="Strong"/>
+          <w:b w:val="0"/>
+          <w:bCs w:val="0"/>
+        </w:rPr>
+        <w:t>Appropriateness of K-means clustering</w:t>
+      </w:r>
+      <w:bookmarkEnd w:id="27"/>
+    </w:p>
+    <w:p>
+      <w:r>
+        <w:t>K</w:t>
+      </w:r>
+      <w:r>
+        <w:t xml:space="preserve">-means clustering is highly effective for partitioning numerical financial data into interpretable groups based on similarity </w:t>
+      </w:r>
+      <w:r>
+        <w:t xml:space="preserve">within groups. </w:t>
+      </w:r>
+      <w:r>
+        <w:t xml:space="preserve">The algorithm is designed to cluster values by minimising the distance between data points and their assigned </w:t>
+      </w:r>
+      <w:r>
+        <w:lastRenderedPageBreak/>
+        <w:t xml:space="preserve">cluster centroid. In terms of </w:t>
+      </w:r>
+      <w:r>
+        <w:t>stock-risk analysis, this allows similar risk-return characteristics to be grouped together efficiently</w:t>
+      </w:r>
+      <w:r>
+        <w:t xml:space="preserve">, making it suited for portfolio segmentation. </w:t>
+      </w:r>
+    </w:p>
+    <w:p>
+      <w:r>
+        <w:t>The simplicity and in turn</w:t>
+      </w:r>
+      <w:r>
+        <w:t xml:space="preserve"> lack of computational power needed to run, </w:t>
+      </w:r>
+      <w:r>
+        <w:t xml:space="preserve">makes it potentially more suited </w:t>
+      </w:r>
+      <w:r>
+        <w:t xml:space="preserve">for financial analysis. It is much faster to compute than agglomerative clustering </w:t>
+      </w:r>
+      <w:r>
+        <w:t xml:space="preserve">on large datasets and produces clear centroid-based clusters that are fairly easy to interpret. </w:t>
+      </w:r>
+    </w:p>
+    <w:p>
+      <w:pPr>
+        <w:pStyle w:val="Heading2"/>
+        <w:rPr>
+          <w:rStyle w:val="Strong"/>
+          <w:b w:val="0"/>
+          <w:bCs w:val="0"/>
+        </w:rPr>
+      </w:pPr>
+      <w:bookmarkStart w:id="28" w:name="_Toc226965386"/>
+      <w:r>
+        <w:rPr>
+          <w:rStyle w:val="Strong"/>
+          <w:b w:val="0"/>
+          <w:bCs w:val="0"/>
+        </w:rPr>
+        <w:t>Remove Skewness and Scaling</w:t>
+      </w:r>
+      <w:bookmarkEnd w:id="28"/>
+    </w:p>
+    <w:p>
+      <w:r>
+        <w:t xml:space="preserve">Before proceeding with the clustering, it was important to check the input data for skewness. </w:t>
+      </w:r>
+      <w:r>
+        <w:t xml:space="preserve">This is because k-means is highly sensitive to feature distributions and scale. K-means assigns clusters by calculating Euclidean distance of points based around a cluster centroid. However, if there are large numerical ranges or data that is highly skewed, it can dominate distance calculations and therefore distort the results.  </w:t>
+      </w:r>
+    </w:p>
+    <w:p/>
+    <w:p>
+      <w:r>
+        <w:lastRenderedPageBreak/>
+        <w:t xml:space="preserve">In order to identify this visually, the input data for the 3 features were plotted in a histogram to identify the shape of the distribution. </w:t>
+      </w:r>
+      <w:r>
+        <w:rPr>
+          <w:noProof/>
+        </w:rPr>
+        <w:drawing>
+          <wp:inline distT="0" distB="0" distL="0" distR="0" wp14:anchorId="4611109A" wp14:editId="17B6BF23">
+            <wp:extent cx="5731510" cy="4768215"/>
+            <wp:effectExtent l="0" t="0" r="0" b="0"/>
+            <wp:docPr id="367983986" name="Picture 1"/>
+            <wp:cNvGraphicFramePr>
+              <a:graphicFrameLocks xmlns:a="http://schemas.openxmlformats.org/drawingml/2006/main" noChangeAspect="1"/>
+            </wp:cNvGraphicFramePr>
+            <a:graphic xmlns:a="http://schemas.openxmlformats.org/drawingml/2006/main">
+              <a:graphicData uri="http://schemas.openxmlformats.org/drawingml/2006/picture">
+                <pic:pic xmlns:pic="http://schemas.openxmlformats.org/drawingml/2006/picture">
+                  <pic:nvPicPr>
+                    <pic:cNvPr id="0" name="Picture 1"/>
+                    <pic:cNvPicPr>
+                      <a:picLocks noChangeAspect="1" noChangeArrowheads="1"/>
+                    </pic:cNvPicPr>
+                  </pic:nvPicPr>
+                  <pic:blipFill>
+                    <a:blip r:embed="rId20">
+                      <a:extLst>
+                        <a:ext uri="{28A0092B-C50C-407E-A947-70E740481C1C}">
+                          <a14:useLocalDpi xmlns:a14="http://schemas.microsoft.com/office/drawing/2010/main" val="0"/>
+                        </a:ext>
+                      </a:extLst>
+                    </a:blip>
+                    <a:srcRect/>
+                    <a:stretch>
+                      <a:fillRect/>
+                    </a:stretch>
+                  </pic:blipFill>
+                  <pic:spPr bwMode="auto">
+                    <a:xfrm>
+                      <a:off x="0" y="0"/>
+                      <a:ext cx="5731510" cy="4768215"/>
+                    </a:xfrm>
+                    <a:prstGeom prst="rect">
+                      <a:avLst/>
+                    </a:prstGeom>
+                    <a:noFill/>
+                    <a:ln>
+                      <a:noFill/>
+                    </a:ln>
+                  </pic:spPr>
+                </pic:pic>
+              </a:graphicData>
+            </a:graphic>
+          </wp:inline>
+        </w:drawing>
+      </w:r>
+    </w:p>
+    <w:p/>
+    <w:p>
+      <w:pPr>
+        <w:pStyle w:val="Heading3"/>
+      </w:pPr>
+      <w:bookmarkStart w:id="29" w:name="_Toc226965387"/>
+      <w:r>
+        <w:t>Figure 1</w:t>
+      </w:r>
+      <w:r>
+        <w:t>3</w:t>
+      </w:r>
+      <w:r>
+        <w:t>. Histogram of distribution of input data before normalisation.</w:t>
+      </w:r>
+      <w:bookmarkEnd w:id="29"/>
+    </w:p>
+    <w:p>
+      <w:r>
+        <w:t xml:space="preserve">The plots showed that all 3 of the variable distributions displayed skewness. Beta and annual volatility in particular showed heavy left-sides skewness. </w:t>
+      </w:r>
+    </w:p>
+    <w:p>
+      <w:r>
+        <w:t xml:space="preserve">To remove this skewness, the data would need to be transformed, the chosen method of transformation was Box-Cox transformation. Although, average daily return could not be </w:t>
+      </w:r>
+      <w:r>
+        <w:lastRenderedPageBreak/>
+        <w:t xml:space="preserve">directly put into this algorithm as it contained negative values and in order to perform any logarithm, the values would need to all be positive in order to the output to be valid. </w:t>
+      </w:r>
+    </w:p>
+    <w:p>
+      <w:r>
+        <w:t xml:space="preserve">To address this, average daily return was shifted upward so that all values would become positive. </w:t>
+      </w:r>
+      <w:r>
+        <w:t>A</w:t>
+      </w:r>
+      <w:r>
+        <w:t xml:space="preserve">ll the input values were </w:t>
+      </w:r>
+      <w:r>
+        <w:t xml:space="preserve">then </w:t>
+      </w:r>
+      <w:r>
+        <w:t xml:space="preserve">put through a box-cox transformation. </w:t>
+      </w:r>
+    </w:p>
+    <w:p>
+      <w:r>
+        <w:t xml:space="preserve">The distributions for each feature were then replotted for visual skew analysis. </w:t>
+      </w:r>
+    </w:p>
+    <w:p>
+      <w:r>
+        <w:rPr>
+          <w:noProof/>
+        </w:rPr>
+        <w:drawing>
+          <wp:inline distT="0" distB="0" distL="0" distR="0" wp14:anchorId="58CF575D" wp14:editId="255766B9">
+            <wp:extent cx="5731510" cy="4768215"/>
+            <wp:effectExtent l="0" t="0" r="0" b="0"/>
+            <wp:docPr id="354654531" name="Picture 2"/>
+            <wp:cNvGraphicFramePr>
+              <a:graphicFrameLocks xmlns:a="http://schemas.openxmlformats.org/drawingml/2006/main" noChangeAspect="1"/>
+            </wp:cNvGraphicFramePr>
+            <a:graphic xmlns:a="http://schemas.openxmlformats.org/drawingml/2006/main">
+              <a:graphicData uri="http://schemas.openxmlformats.org/drawingml/2006/picture">
+                <pic:pic xmlns:pic="http://schemas.openxmlformats.org/drawingml/2006/picture">
+                  <pic:nvPicPr>
+                    <pic:cNvPr id="0" name="Picture 3"/>
+                    <pic:cNvPicPr>
+                      <a:picLocks noChangeAspect="1" noChangeArrowheads="1"/>
+                    </pic:cNvPicPr>
+                  </pic:nvPicPr>
+                  <pic:blipFill>
+                    <a:blip r:embed="rId21">
+                      <a:extLst>
+                        <a:ext uri="{28A0092B-C50C-407E-A947-70E740481C1C}">
+                          <a14:useLocalDpi xmlns:a14="http://schemas.microsoft.com/office/drawing/2010/main" val="0"/>
+                        </a:ext>
+                      </a:extLst>
+                    </a:blip>
+                    <a:srcRect/>
+                    <a:stretch>
+                      <a:fillRect/>
+                    </a:stretch>
+                  </pic:blipFill>
+                  <pic:spPr bwMode="auto">
+                    <a:xfrm>
+                      <a:off x="0" y="0"/>
+                      <a:ext cx="5731510" cy="4768215"/>
+                    </a:xfrm>
+                    <a:prstGeom prst="rect">
+                      <a:avLst/>
+                    </a:prstGeom>
+                    <a:noFill/>
+                    <a:ln>
+                      <a:noFill/>
+                    </a:ln>
+                  </pic:spPr>
+                </pic:pic>
+              </a:graphicData>
+            </a:graphic>
+          </wp:inline>
+        </w:drawing>
+      </w:r>
+    </w:p>
+    <w:p>
+      <w:pPr>
+        <w:pStyle w:val="Heading3"/>
+      </w:pPr>
+      <w:bookmarkStart w:id="30" w:name="_Toc226965388"/>
+      <w:r>
+        <w:t>Figure 1</w:t>
+      </w:r>
+      <w:r>
+        <w:t>4</w:t>
+      </w:r>
+      <w:r>
+        <w:t>. Distribution of input data prior to normalisation.</w:t>
+      </w:r>
+      <w:bookmarkEnd w:id="30"/>
+    </w:p>
+    <w:p>
+      <w:r>
+        <w:t xml:space="preserve">The new plots show a much more even and symmetrical distribution and confirms normalisation of the input data. </w:t>
+      </w:r>
+    </w:p>
+    <w:p>
+      <w:r>
+        <w:lastRenderedPageBreak/>
+        <w:t xml:space="preserve">After the removal of skewness in the data, all the transformed variables were standardised using the </w:t>
+      </w:r>
+      <w:proofErr w:type="spellStart"/>
+      <w:r>
+        <w:t>StandardScaler</w:t>
+      </w:r>
+      <w:proofErr w:type="spellEnd"/>
+      <w:r>
+        <w:t xml:space="preserve">. </w:t>
+      </w:r>
+      <w:r>
+        <w:t>This would ensure equal contribution in distance-based clustering.</w:t>
+      </w:r>
+    </w:p>
+    <w:p>
+      <w:r>
+        <w:t xml:space="preserve">Scaling is also vitally important as the 3 variables operate on different numerical scales; therefore, it needs to be standardised as variables that inherently contain larger magnitudes will dominate the distance calculation. To ensure each variable would equally contribute to centroid formation the variables were all scaled. </w:t>
+      </w:r>
+    </w:p>
+    <w:p>
+      <w:pPr>
+        <w:pStyle w:val="Heading2"/>
+        <w:rPr>
+          <w:rStyle w:val="Strong"/>
+          <w:b w:val="0"/>
+          <w:bCs w:val="0"/>
+        </w:rPr>
+      </w:pPr>
+      <w:bookmarkStart w:id="31" w:name="_Toc226965389"/>
+      <w:r>
+        <w:rPr>
+          <w:rStyle w:val="Strong"/>
+          <w:b w:val="0"/>
+          <w:bCs w:val="0"/>
+        </w:rPr>
+        <w:t>K-means Clustering Implementation</w:t>
+      </w:r>
+      <w:bookmarkEnd w:id="31"/>
+    </w:p>
+    <w:p>
+      <w:r>
+        <w:t xml:space="preserve">In order to </w:t>
+      </w:r>
+      <w:r>
+        <w:t xml:space="preserve">determine the optimal number of clusters, initially the elbow method was used. </w:t>
+      </w:r>
+      <w:r>
+        <w:t>This technique evaluates cluster performance by calculating inertia</w:t>
+      </w:r>
+      <w:r>
+        <w:t xml:space="preserve"> between data points and their centroids. </w:t>
+      </w:r>
+      <w:r>
+        <w:t>T</w:t>
+      </w:r>
+      <w:r>
+        <w:t xml:space="preserve">he inertia for </w:t>
+      </w:r>
+      <w:r>
+        <w:t>cluster</w:t>
+      </w:r>
+      <w:r>
+        <w:t xml:space="preserve"> values from 1 to 10 were </w:t>
+      </w:r>
+      <w:r>
+        <w:t xml:space="preserve">generated and plotted using the matplotlib library. </w:t>
+      </w:r>
+    </w:p>
+    <w:p>
+      <w:r>
+        <w:rPr>
+          <w:noProof/>
+        </w:rPr>
+        <w:drawing>
+          <wp:inline distT="0" distB="0" distL="0" distR="0" wp14:anchorId="23F68DB0" wp14:editId="01ED40BA">
+            <wp:extent cx="4470400" cy="2984500"/>
+            <wp:effectExtent l="0" t="0" r="0" b="0"/>
+            <wp:docPr id="903431804" name="Picture 9"/>
+            <wp:cNvGraphicFramePr>
+              <a:graphicFrameLocks xmlns:a="http://schemas.openxmlformats.org/drawingml/2006/main" noChangeAspect="1"/>
+            </wp:cNvGraphicFramePr>
+            <a:graphic xmlns:a="http://schemas.openxmlformats.org/drawingml/2006/main">
+              <a:graphicData uri="http://schemas.openxmlformats.org/drawingml/2006/picture">
+                <pic:pic xmlns:pic="http://schemas.openxmlformats.org/drawingml/2006/picture">
+                  <pic:nvPicPr>
+                    <pic:cNvPr id="0" name="Picture 15"/>
+                    <pic:cNvPicPr>
+                      <a:picLocks noChangeAspect="1" noChangeArrowheads="1"/>
+                    </pic:cNvPicPr>
+                  </pic:nvPicPr>
+                  <pic:blipFill>
+                    <a:blip r:embed="rId22">
+                      <a:extLst>
+                        <a:ext uri="{28A0092B-C50C-407E-A947-70E740481C1C}">
+                          <a14:useLocalDpi xmlns:a14="http://schemas.microsoft.com/office/drawing/2010/main" val="0"/>
+                        </a:ext>
+                      </a:extLst>
+                    </a:blip>
+                    <a:srcRect/>
+                    <a:stretch>
+                      <a:fillRect/>
+                    </a:stretch>
+                  </pic:blipFill>
+                  <pic:spPr bwMode="auto">
+                    <a:xfrm>
+                      <a:off x="0" y="0"/>
+                      <a:ext cx="4470400" cy="2984500"/>
+                    </a:xfrm>
+                    <a:prstGeom prst="rect">
+                      <a:avLst/>
+                    </a:prstGeom>
+                    <a:noFill/>
+                    <a:ln>
+                      <a:noFill/>
+                    </a:ln>
+                  </pic:spPr>
+                </pic:pic>
+              </a:graphicData>
+            </a:graphic>
+          </wp:inline>
+        </w:drawing>
+      </w:r>
+    </w:p>
+    <w:p>
+      <w:pPr>
+        <w:pStyle w:val="Heading3"/>
+      </w:pPr>
+      <w:bookmarkStart w:id="32" w:name="_Toc226965390"/>
+      <w:r>
+        <w:lastRenderedPageBreak/>
+        <w:t xml:space="preserve">Figure </w:t>
+      </w:r>
+      <w:r>
+        <w:t>15</w:t>
+      </w:r>
+      <w:r>
+        <w:t>.</w:t>
+      </w:r>
+      <w:r>
+        <w:t xml:space="preserve"> </w:t>
+      </w:r>
+      <w:r>
+        <w:t xml:space="preserve">Graph </w:t>
+      </w:r>
+      <w:r>
+        <w:t xml:space="preserve">of inertia values for k-means models </w:t>
+      </w:r>
+      <w:r>
+        <w:t>from 1-10 cluster values.</w:t>
+      </w:r>
+      <w:bookmarkEnd w:id="32"/>
+      <w:r>
+        <w:t xml:space="preserve"> </w:t>
+      </w:r>
+    </w:p>
+    <w:p>
+      <w:r>
+        <w:t xml:space="preserve">The results showed a sharp decrease in inertia values from 1 to 3 </w:t>
+      </w:r>
+      <w:r>
+        <w:t>clusters;</w:t>
+      </w:r>
+      <w:r>
+        <w:t xml:space="preserve"> this was then followed </w:t>
+      </w:r>
+      <w:r>
+        <w:t>by a noticeable reduction in improvement after 4 clusters. This is represented as the elbow</w:t>
+      </w:r>
+      <w:r>
+        <w:t xml:space="preserve"> and represents the point of diminishing returns. Based off this cluster values around 3 and 4 were identified as the strongest candidates</w:t>
+      </w:r>
+      <w:r>
+        <w:t xml:space="preserve">. </w:t>
+      </w:r>
+    </w:p>
+    <w:p>
+      <w:r>
+        <w:t xml:space="preserve">Given the results from the elbow method, cluster values of 3 and 4 were </w:t>
+      </w:r>
+      <w:r>
+        <w:t xml:space="preserve">evaluated further through visual inspection. </w:t>
+      </w:r>
+    </w:p>
+    <w:p>
+      <w:r>
+        <w:rPr>
+          <w:noProof/>
+        </w:rPr>
+        <w:drawing>
+          <wp:inline distT="0" distB="0" distL="0" distR="0" wp14:anchorId="53D86E1A" wp14:editId="64516C6A">
+            <wp:extent cx="4394200" cy="2984500"/>
+            <wp:effectExtent l="0" t="0" r="0" b="0"/>
+            <wp:docPr id="1428729114" name="Picture 10"/>
+            <wp:cNvGraphicFramePr>
+              <a:graphicFrameLocks xmlns:a="http://schemas.openxmlformats.org/drawingml/2006/main" noChangeAspect="1"/>
+            </wp:cNvGraphicFramePr>
+            <a:graphic xmlns:a="http://schemas.openxmlformats.org/drawingml/2006/main">
+              <a:graphicData uri="http://schemas.openxmlformats.org/drawingml/2006/picture">
+                <pic:pic xmlns:pic="http://schemas.openxmlformats.org/drawingml/2006/picture">
+                  <pic:nvPicPr>
+                    <pic:cNvPr id="0" name="Picture 17"/>
+                    <pic:cNvPicPr>
+                      <a:picLocks noChangeAspect="1" noChangeArrowheads="1"/>
+                    </pic:cNvPicPr>
+                  </pic:nvPicPr>
+                  <pic:blipFill>
+                    <a:blip r:embed="rId23">
+                      <a:extLst>
+                        <a:ext uri="{28A0092B-C50C-407E-A947-70E740481C1C}">
+                          <a14:useLocalDpi xmlns:a14="http://schemas.microsoft.com/office/drawing/2010/main" val="0"/>
+                        </a:ext>
+                      </a:extLst>
+                    </a:blip>
+                    <a:srcRect/>
+                    <a:stretch>
+                      <a:fillRect/>
+                    </a:stretch>
+                  </pic:blipFill>
+                  <pic:spPr bwMode="auto">
+                    <a:xfrm>
+                      <a:off x="0" y="0"/>
+                      <a:ext cx="4394200" cy="2984500"/>
+                    </a:xfrm>
+                    <a:prstGeom prst="rect">
+                      <a:avLst/>
+                    </a:prstGeom>
+                    <a:noFill/>
+                    <a:ln>
+                      <a:noFill/>
+                    </a:ln>
+                  </pic:spPr>
+                </pic:pic>
+              </a:graphicData>
+            </a:graphic>
+          </wp:inline>
+        </w:drawing>
+      </w:r>
+    </w:p>
+    <w:p>
+      <w:pPr>
+        <w:pStyle w:val="Heading3"/>
+      </w:pPr>
+      <w:bookmarkStart w:id="33" w:name="_Toc226965391"/>
+      <w:r>
+        <w:t>Figure 16</w:t>
+      </w:r>
+      <w:r>
+        <w:t>.</w:t>
+      </w:r>
+      <w:r>
+        <w:t xml:space="preserve"> K=4 cluster segmentation plot.</w:t>
+      </w:r>
+      <w:bookmarkEnd w:id="33"/>
+    </w:p>
+    <w:p/>
+    <w:p>
+      <w:r>
+        <w:t xml:space="preserve">The k=3 </w:t>
+      </w:r>
+      <w:r>
+        <w:t>solution p</w:t>
+      </w:r>
+      <w:r>
+        <w:t>roduces three clearly defined groups that correspond loosely to low-risk, medium-risk and high-risk stocks. Although</w:t>
+      </w:r>
+      <w:r>
+        <w:t xml:space="preserve">, despite the clear separation between </w:t>
+      </w:r>
+      <w:r>
+        <w:lastRenderedPageBreak/>
+        <w:t xml:space="preserve">groups, the middle cluster in particular lacks </w:t>
+      </w:r>
+      <w:r>
+        <w:t xml:space="preserve">any real depth as it is extremely broad. </w:t>
+      </w:r>
+      <w:r>
+        <w:t xml:space="preserve">This therefore limits its </w:t>
+      </w:r>
+      <w:r>
+        <w:t xml:space="preserve">relevance to a detailed portfolio analysis. </w:t>
+      </w:r>
+    </w:p>
+    <w:p>
+      <w:r>
+        <w:rPr>
+          <w:noProof/>
+        </w:rPr>
+        <w:drawing>
+          <wp:inline distT="0" distB="0" distL="0" distR="0" wp14:anchorId="67782DEC" wp14:editId="51754F69">
+            <wp:extent cx="4394200" cy="2984500"/>
+            <wp:effectExtent l="0" t="0" r="0" b="0"/>
+            <wp:docPr id="1127199562" name="Picture 11"/>
+            <wp:cNvGraphicFramePr>
+              <a:graphicFrameLocks xmlns:a="http://schemas.openxmlformats.org/drawingml/2006/main" noChangeAspect="1"/>
+            </wp:cNvGraphicFramePr>
+            <a:graphic xmlns:a="http://schemas.openxmlformats.org/drawingml/2006/main">
+              <a:graphicData uri="http://schemas.openxmlformats.org/drawingml/2006/picture">
+                <pic:pic xmlns:pic="http://schemas.openxmlformats.org/drawingml/2006/picture">
+                  <pic:nvPicPr>
+                    <pic:cNvPr id="0" name="Picture 19"/>
+                    <pic:cNvPicPr>
+                      <a:picLocks noChangeAspect="1" noChangeArrowheads="1"/>
+                    </pic:cNvPicPr>
+                  </pic:nvPicPr>
+                  <pic:blipFill>
+                    <a:blip r:embed="rId24">
+                      <a:extLst>
+                        <a:ext uri="{28A0092B-C50C-407E-A947-70E740481C1C}">
+                          <a14:useLocalDpi xmlns:a14="http://schemas.microsoft.com/office/drawing/2010/main" val="0"/>
+                        </a:ext>
+                      </a:extLst>
+                    </a:blip>
+                    <a:srcRect/>
+                    <a:stretch>
+                      <a:fillRect/>
+                    </a:stretch>
+                  </pic:blipFill>
+                  <pic:spPr bwMode="auto">
+                    <a:xfrm>
+                      <a:off x="0" y="0"/>
+                      <a:ext cx="4394200" cy="2984500"/>
+                    </a:xfrm>
+                    <a:prstGeom prst="rect">
+                      <a:avLst/>
+                    </a:prstGeom>
+                    <a:noFill/>
+                    <a:ln>
+                      <a:noFill/>
+                    </a:ln>
+                  </pic:spPr>
+                </pic:pic>
+              </a:graphicData>
+            </a:graphic>
+          </wp:inline>
+        </w:drawing>
+      </w:r>
+    </w:p>
+    <w:p>
+      <w:pPr>
+        <w:pStyle w:val="Heading3"/>
+      </w:pPr>
+      <w:bookmarkStart w:id="34" w:name="_Toc226965392"/>
+      <w:r>
+        <w:t>Figure 1</w:t>
+      </w:r>
+      <w:r>
+        <w:t>7</w:t>
+      </w:r>
+      <w:r>
+        <w:t>.</w:t>
+      </w:r>
+      <w:r>
+        <w:t xml:space="preserve"> </w:t>
+      </w:r>
+      <w:r>
+        <w:t xml:space="preserve">K=4 </w:t>
+      </w:r>
+      <w:r>
+        <w:t>cluster segmentation plot</w:t>
+      </w:r>
+      <w:r>
+        <w:t>.</w:t>
+      </w:r>
+      <w:bookmarkEnd w:id="34"/>
+    </w:p>
+    <w:p>
+      <w:r>
+        <w:t xml:space="preserve">The k=4 solution provides a more refined segmentation of the data. </w:t>
+      </w:r>
+      <w:r>
+        <w:t xml:space="preserve">This extra level of detail is valuable for portfolio analysis and allows four interpretable and financially meaningful categories. </w:t>
+      </w:r>
+    </w:p>
+    <w:p>
+      <w:pPr>
+        <w:pStyle w:val="ListParagraph"/>
+        <w:numPr>
+          <w:ilvl w:val="0"/>
+          <w:numId w:val="2"/>
+        </w:numPr>
+      </w:pPr>
+      <w:r>
+        <w:t>Defensive low-risk stocks (low beta, low volatility)</w:t>
+      </w:r>
+    </w:p>
+    <w:p>
+      <w:pPr>
+        <w:pStyle w:val="ListParagraph"/>
+        <w:numPr>
+          <w:ilvl w:val="0"/>
+          <w:numId w:val="2"/>
+        </w:numPr>
+      </w:pPr>
+      <w:r>
+        <w:t>Stable core holdings (moderate beta, low volatility)</w:t>
+      </w:r>
+    </w:p>
+    <w:p>
+      <w:pPr>
+        <w:pStyle w:val="ListParagraph"/>
+        <w:numPr>
+          <w:ilvl w:val="0"/>
+          <w:numId w:val="2"/>
+        </w:numPr>
+      </w:pPr>
+      <w:r>
+        <w:t>Moderate growth stocks (higher beta, moderate volatility)</w:t>
+      </w:r>
+    </w:p>
+    <w:p>
+      <w:pPr>
+        <w:pStyle w:val="ListParagraph"/>
+        <w:numPr>
+          <w:ilvl w:val="0"/>
+          <w:numId w:val="2"/>
+        </w:numPr>
+      </w:pPr>
+      <w:r>
+        <w:t>Aggressive high-risk stocks (high beta, high volatility)</w:t>
+      </w:r>
+    </w:p>
+    <w:p>
+      <w:r>
+        <w:t xml:space="preserve">As a result, K=4 was selected as the optimal number of clusters for the final k-means model. </w:t>
+      </w:r>
+    </w:p>
+    <w:p/>
+    <w:p/>
+    <w:p/>
+    <w:p/>
+    <w:p/>
+    <w:p/>
+    <w:p/>
+    <w:p>
+      <w:r>
+        <w:t xml:space="preserve"> </w:t>
+      </w:r>
+    </w:p>
     <w:sectPr>
-      <w:footerReference w:type="even" r:id="rId18"/>
-      <w:footerReference w:type="default" r:id="rId19"/>
+      <w:footerReference w:type="even" r:id="rId25"/>
+      <w:footerReference w:type="default" r:id="rId26"/>
       <w:pgSz w:w="11906" w:h="16838"/>
       <w:pgMar w:top="1440" w:right="1440" w:bottom="1440" w:left="1440" w:header="708" w:footer="708" w:gutter="0"/>
       <w:cols w:space="708"/>
@@ -2877,6 +5200,11 @@
         <w:docPartUnique/>
       </w:docPartObj>
     </w:sdtPr>
+    <w:sdtEndPr>
+      <w:rPr>
+        <w:rStyle w:val="PageNumber"/>
+      </w:rPr>
+    </w:sdtEndPr>
     <w:sdtContent>
       <w:p>
         <w:pPr>
@@ -2935,6 +5263,11 @@
         <w:docPartUnique/>
       </w:docPartObj>
     </w:sdtPr>
+    <w:sdtEndPr>
+      <w:rPr>
+        <w:rStyle w:val="PageNumber"/>
+      </w:rPr>
+    </w:sdtEndPr>
     <w:sdtContent>
       <w:p>
         <w:pPr>
@@ -3163,8 +5496,124 @@
       </w:rPr>
     </w:lvl>
   </w:abstractNum>
+  <w:abstractNum w:abstractNumId="1" w15:restartNumberingAfterBreak="0">
+    <w:nsid w:val="5D0002CE"/>
+    <w:multiLevelType w:val="hybridMultilevel"/>
+    <w:tmpl w:val="FD60E208"/>
+    <w:lvl w:ilvl="0" w:tplc="08090001">
+      <w:start w:val="1"/>
+      <w:numFmt w:val="bullet"/>
+      <w:lvlText w:val=""/>
+      <w:lvlJc w:val="left"/>
+      <w:pPr>
+        <w:ind w:left="720" w:hanging="360"/>
+      </w:pPr>
+      <w:rPr>
+        <w:rFonts w:ascii="Symbol" w:hAnsi="Symbol" w:hint="default"/>
+      </w:rPr>
+    </w:lvl>
+    <w:lvl w:ilvl="1" w:tplc="08090003" w:tentative="1">
+      <w:start w:val="1"/>
+      <w:numFmt w:val="bullet"/>
+      <w:lvlText w:val="o"/>
+      <w:lvlJc w:val="left"/>
+      <w:pPr>
+        <w:ind w:left="1440" w:hanging="360"/>
+      </w:pPr>
+      <w:rPr>
+        <w:rFonts w:ascii="Courier New" w:hAnsi="Courier New" w:cs="Courier New" w:hint="default"/>
+      </w:rPr>
+    </w:lvl>
+    <w:lvl w:ilvl="2" w:tplc="08090005" w:tentative="1">
+      <w:start w:val="1"/>
+      <w:numFmt w:val="bullet"/>
+      <w:lvlText w:val=""/>
+      <w:lvlJc w:val="left"/>
+      <w:pPr>
+        <w:ind w:left="2160" w:hanging="360"/>
+      </w:pPr>
+      <w:rPr>
+        <w:rFonts w:ascii="Wingdings" w:hAnsi="Wingdings" w:hint="default"/>
+      </w:rPr>
+    </w:lvl>
+    <w:lvl w:ilvl="3" w:tplc="08090001" w:tentative="1">
+      <w:start w:val="1"/>
+      <w:numFmt w:val="bullet"/>
+      <w:lvlText w:val=""/>
+      <w:lvlJc w:val="left"/>
+      <w:pPr>
+        <w:ind w:left="2880" w:hanging="360"/>
+      </w:pPr>
+      <w:rPr>
+        <w:rFonts w:ascii="Symbol" w:hAnsi="Symbol" w:hint="default"/>
+      </w:rPr>
+    </w:lvl>
+    <w:lvl w:ilvl="4" w:tplc="08090003" w:tentative="1">
+      <w:start w:val="1"/>
+      <w:numFmt w:val="bullet"/>
+      <w:lvlText w:val="o"/>
+      <w:lvlJc w:val="left"/>
+      <w:pPr>
+        <w:ind w:left="3600" w:hanging="360"/>
+      </w:pPr>
+      <w:rPr>
+        <w:rFonts w:ascii="Courier New" w:hAnsi="Courier New" w:cs="Courier New" w:hint="default"/>
+      </w:rPr>
+    </w:lvl>
+    <w:lvl w:ilvl="5" w:tplc="08090005" w:tentative="1">
+      <w:start w:val="1"/>
+      <w:numFmt w:val="bullet"/>
+      <w:lvlText w:val=""/>
+      <w:lvlJc w:val="left"/>
+      <w:pPr>
+        <w:ind w:left="4320" w:hanging="360"/>
+      </w:pPr>
+      <w:rPr>
+        <w:rFonts w:ascii="Wingdings" w:hAnsi="Wingdings" w:hint="default"/>
+      </w:rPr>
+    </w:lvl>
+    <w:lvl w:ilvl="6" w:tplc="08090001" w:tentative="1">
+      <w:start w:val="1"/>
+      <w:numFmt w:val="bullet"/>
+      <w:lvlText w:val=""/>
+      <w:lvlJc w:val="left"/>
+      <w:pPr>
+        <w:ind w:left="5040" w:hanging="360"/>
+      </w:pPr>
+      <w:rPr>
+        <w:rFonts w:ascii="Symbol" w:hAnsi="Symbol" w:hint="default"/>
+      </w:rPr>
+    </w:lvl>
+    <w:lvl w:ilvl="7" w:tplc="08090003" w:tentative="1">
+      <w:start w:val="1"/>
+      <w:numFmt w:val="bullet"/>
+      <w:lvlText w:val="o"/>
+      <w:lvlJc w:val="left"/>
+      <w:pPr>
+        <w:ind w:left="5760" w:hanging="360"/>
+      </w:pPr>
+      <w:rPr>
+        <w:rFonts w:ascii="Courier New" w:hAnsi="Courier New" w:cs="Courier New" w:hint="default"/>
+      </w:rPr>
+    </w:lvl>
+    <w:lvl w:ilvl="8" w:tplc="08090005" w:tentative="1">
+      <w:start w:val="1"/>
+      <w:numFmt w:val="bullet"/>
+      <w:lvlText w:val=""/>
+      <w:lvlJc w:val="left"/>
+      <w:pPr>
+        <w:ind w:left="6480" w:hanging="360"/>
+      </w:pPr>
+      <w:rPr>
+        <w:rFonts w:ascii="Wingdings" w:hAnsi="Wingdings" w:hint="default"/>
+      </w:rPr>
+    </w:lvl>
+  </w:abstractNum>
   <w:num w:numId="1" w16cid:durableId="1874533880">
     <w:abstractNumId w:val="0"/>
+  </w:num>
+  <w:num w:numId="2" w16cid:durableId="1892381202">
+    <w:abstractNumId w:val="1"/>
   </w:num>
 </w:numbering>
 </file>
@@ -3184,7 +5633,7 @@
     </w:rPrDefault>
     <w:pPrDefault>
       <w:pPr>
-        <w:spacing w:after="160" w:line="278" w:lineRule="auto"/>
+        <w:spacing w:after="160" w:line="480" w:lineRule="auto"/>
       </w:pPr>
     </w:pPrDefault>
   </w:docDefaults>
@@ -3619,7 +6068,6 @@
     <w:next w:val="Normal"/>
     <w:link w:val="Heading3Char"/>
     <w:uiPriority w:val="9"/>
-    <w:semiHidden/>
     <w:unhideWhenUsed/>
     <w:qFormat/>
     <w:rsid w:val="001260BC"/>
@@ -3771,7 +6219,6 @@
   <w:style w:type="character" w:default="1" w:styleId="DefaultParagraphFont">
     <w:name w:val="Default Paragraph Font"/>
     <w:uiPriority w:val="1"/>
-    <w:semiHidden/>
     <w:unhideWhenUsed/>
   </w:style>
   <w:style w:type="table" w:default="1" w:styleId="TableNormal">
@@ -3826,7 +6273,6 @@
     <w:basedOn w:val="DefaultParagraphFont"/>
     <w:link w:val="Heading3"/>
     <w:uiPriority w:val="9"/>
-    <w:semiHidden/>
     <w:rsid w:val="001260BC"/>
     <w:rPr>
       <w:rFonts w:eastAsiaTheme="majorEastAsia" w:cstheme="majorBidi"/>
@@ -4160,7 +6606,6 @@
     <w:next w:val="Normal"/>
     <w:autoRedefine/>
     <w:uiPriority w:val="39"/>
-    <w:semiHidden/>
     <w:unhideWhenUsed/>
     <w:rsid w:val="001260BC"/>
     <w:pPr>
@@ -4337,6 +6782,28 @@
     <w:semiHidden/>
     <w:unhideWhenUsed/>
     <w:rsid w:val="001260BC"/>
+  </w:style>
+  <w:style w:type="paragraph" w:styleId="Header">
+    <w:name w:val="header"/>
+    <w:basedOn w:val="Normal"/>
+    <w:link w:val="HeaderChar"/>
+    <w:uiPriority w:val="99"/>
+    <w:unhideWhenUsed/>
+    <w:rsid w:val="00B32BC6"/>
+    <w:pPr>
+      <w:tabs>
+        <w:tab w:val="center" w:pos="4513"/>
+        <w:tab w:val="right" w:pos="9026"/>
+      </w:tabs>
+      <w:spacing w:after="0" w:line="240" w:lineRule="auto"/>
+    </w:pPr>
+  </w:style>
+  <w:style w:type="character" w:customStyle="1" w:styleId="HeaderChar">
+    <w:name w:val="Header Char"/>
+    <w:basedOn w:val="DefaultParagraphFont"/>
+    <w:link w:val="Header"/>
+    <w:uiPriority w:val="99"/>
+    <w:rsid w:val="00B32BC6"/>
   </w:style>
 </w:styles>
 </file>

</xml_diff>